<commit_message>
Korrigjim i planit: Menaxhim financiar (IT e biznesit) në vitin 2 semestri 1, me skedar korrigjimesh të gjurmueshëm
Co-Authored-By: Claude Sonnet 5.5 <noreply@anthropic.com>
Claude-Session: https://claude.ai/code/session_01BybxYwKhdCxZ7QT7Mx6uTb
</commit_message>
<xml_diff>
--- a/docs/Kapitulli_IV_UETassist.docx
+++ b/docs/Kapitulli_IV_UETassist.docx
@@ -1204,95 +1204,6 @@
                 <w:sz w:val="22"/>
                 <w:szCs w:val="22"/>
               </w:rPr>
-              <w:t xml:space="preserve">Menaxhim financiar</w:t>
-            </w:r>
-          </w:p>
-        </w:tc>
-        <w:tc>
-          <w:tcPr>
-            <w:tcW w:type="dxa" w:w="1300"/>
-            <w:tcBorders>
-              <w:top w:val="single" w:color="999999" w:sz="4"/>
-              <w:left w:val="single" w:color="999999" w:sz="4"/>
-              <w:bottom w:val="single" w:color="999999" w:sz="4"/>
-              <w:right w:val="single" w:color="999999" w:sz="4"/>
-            </w:tcBorders>
-            <w:tcMar>
-              <w:top w:type="dxa" w:w="60"/>
-              <w:left w:type="dxa" w:w="100"/>
-              <w:bottom w:type="dxa" w:w="60"/>
-              <w:right w:type="dxa" w:w="100"/>
-            </w:tcMar>
-          </w:tcPr>
-          <w:p>
-            <w:r>
-              <w:rPr>
-                <w:rFonts w:ascii="Times New Roman" w:cs="Times New Roman" w:eastAsia="Times New Roman" w:hAnsi="Times New Roman"/>
-                <w:b w:val="false"/>
-                <w:bCs w:val="false"/>
-                <w:sz w:val="22"/>
-                <w:szCs w:val="22"/>
-              </w:rPr>
-              <w:t xml:space="preserve">6</w:t>
-            </w:r>
-          </w:p>
-        </w:tc>
-        <w:tc>
-          <w:tcPr>
-            <w:tcW w:type="dxa" w:w="3100"/>
-            <w:tcBorders>
-              <w:top w:val="single" w:color="999999" w:sz="4"/>
-              <w:left w:val="single" w:color="999999" w:sz="4"/>
-              <w:bottom w:val="single" w:color="999999" w:sz="4"/>
-              <w:right w:val="single" w:color="999999" w:sz="4"/>
-            </w:tcBorders>
-            <w:tcMar>
-              <w:top w:type="dxa" w:w="60"/>
-              <w:left w:type="dxa" w:w="100"/>
-              <w:bottom w:type="dxa" w:w="60"/>
-              <w:right w:type="dxa" w:w="100"/>
-            </w:tcMar>
-          </w:tcPr>
-          <w:p>
-            <w:r>
-              <w:rPr>
-                <w:rFonts w:ascii="Times New Roman" w:cs="Times New Roman" w:eastAsia="Times New Roman" w:hAnsi="Times New Roman"/>
-                <w:b w:val="false"/>
-                <w:bCs w:val="false"/>
-                <w:sz w:val="22"/>
-                <w:szCs w:val="22"/>
-              </w:rPr>
-              <w:t xml:space="preserve">Ndërdisiplinore, specializimi IT e biznesit</w:t>
-            </w:r>
-          </w:p>
-        </w:tc>
-      </w:tr>
-      <w:tr>
-        <w:tc>
-          <w:tcPr>
-            <w:tcW w:type="dxa" w:w="5200"/>
-            <w:tcBorders>
-              <w:top w:val="single" w:color="999999" w:sz="4"/>
-              <w:left w:val="single" w:color="999999" w:sz="4"/>
-              <w:bottom w:val="single" w:color="999999" w:sz="4"/>
-              <w:right w:val="single" w:color="999999" w:sz="4"/>
-            </w:tcBorders>
-            <w:tcMar>
-              <w:top w:type="dxa" w:w="60"/>
-              <w:left w:type="dxa" w:w="100"/>
-              <w:bottom w:type="dxa" w:w="60"/>
-              <w:right w:type="dxa" w:w="100"/>
-            </w:tcMar>
-          </w:tcPr>
-          <w:p>
-            <w:r>
-              <w:rPr>
-                <w:rFonts w:ascii="Times New Roman" w:cs="Times New Roman" w:eastAsia="Times New Roman" w:hAnsi="Times New Roman"/>
-                <w:b w:val="false"/>
-                <w:bCs w:val="false"/>
-                <w:sz w:val="22"/>
-                <w:szCs w:val="22"/>
-              </w:rPr>
               <w:t xml:space="preserve">Punimi i diplomës</w:t>
             </w:r>
           </w:p>
@@ -1374,7 +1285,7 @@
           <w:sz w:val="24"/>
           <w:szCs w:val="24"/>
         </w:rPr>
-        <w:t xml:space="preserve">Programi Master i Shkencave ka gjithsej katër semestra, dy te viti i parë dhe dy te viti i dytë. Lëndët e shënuara «viti i plotë», si Praktika profesionale dhe Punimi i diplomës, numërohen vetëm te semestri i dytë i vitit përkatës. Për programet që nuk i lidhin lëndët me specializim në mënyrë të besueshme te tabela, sistemi shfaq vetëm lëndët e përbashkëta dhe nuk hamendëson përkatësinë.</w:t>
+        <w:t xml:space="preserve">Programi Master i Shkencave ka gjithsej katër semestra, dy te viti i parë dhe dy te viti i dytë. Lëndët e shënuara «viti i plotë», si Praktika profesionale dhe Punimi i diplomës, numërohen vetëm te semestri i dytë i vitit përkatës. Për programet që nuk i lidhin lëndët me specializim në mënyrë të besueshme te tabela, sistemi shfaq vetëm lëndët e përbashkëta dhe nuk hamendëson përkatësinë. Kur plani aktual dallon nga dokumenti PDF, p.sh. kur një lëndë është zhvendosur në një semestër tjetër, korrigjimi regjistrohet në një skedar të veçantë me arsyen dhe vlerën origjinale të dokumentit. Lënda ruan të dyja vlerat dhe shënohet si e korrigjuar, kështu që ndryshimi mbetet i gjurmueshëm dhe nuk fshihet në heshtje.</w:t>
       </w:r>
     </w:p>
     <w:p>

</xml_diff>

<commit_message>
Shto skemën e procesit RAG (PNG/SVG) dhe vendose te Kapitulli IV (Figura 4.8)
Co-Authored-By: Claude Sonnet 5.5 <noreply@anthropic.com>
Claude-Session: https://claude.ai/code/session_01BybxYwKhdCxZ7QT7Mx6uTb
</commit_message>
<xml_diff>
--- a/docs/Kapitulli_IV_UETassist.docx
+++ b/docs/Kapitulli_IV_UETassist.docx
@@ -2273,26 +2273,49 @@
     </w:p>
     <w:p>
       <w:pPr>
-        <w:pBdr>
-          <w:top w:val="single" w:color="999999" w:sz="6" w:space="8"/>
-          <w:bottom w:val="single" w:color="999999" w:sz="6" w:space="8"/>
-          <w:left w:val="single" w:color="999999" w:sz="6" w:space="8"/>
-          <w:right w:val="single" w:color="999999" w:sz="6" w:space="8"/>
-        </w:pBdr>
+        <w:keepNext/>
         <w:spacing w:after="60" w:before="160"/>
         <w:jc w:val="center"/>
       </w:pPr>
       <w:r>
-        <w:rPr>
-          <w:rFonts w:ascii="Times New Roman" w:cs="Times New Roman" w:eastAsia="Times New Roman" w:hAnsi="Times New Roman"/>
-          <w:i/>
-          <w:iCs/>
-          <w:sz w:val="22"/>
-          <w:szCs w:val="22"/>
-          <w:highlight w:val="yellow"/>
-          <w:highlightCs w:val="yellow"/>
-        </w:rPr>
-        <w:t xml:space="preserve">[Vendos këtu screenshot-in: skema: pyetja, profili, kërkimi në ChromaDB, konteksti, modeli gjuhësor, përgjigja me burime]</w:t>
+        <w:drawing>
+          <wp:inline distT="0" distB="0" distL="0" distR="0">
+            <wp:extent cx="5715000" cy="3686175"/>
+            <wp:effectExtent t="0" r="0" b="0" l="0"/>
+            <wp:docPr id="1" name="figura-4.8" descr="Skema e procesit RAG të UETassist" title="Figura 4.8"/>
+            <wp:cNvGraphicFramePr>
+              <a:graphicFrameLocks xmlns:a="http://schemas.openxmlformats.org/drawingml/2006/main" noChangeAspect="1"/>
+            </wp:cNvGraphicFramePr>
+            <a:graphic xmlns:a="http://schemas.openxmlformats.org/drawingml/2006/main">
+              <a:graphicData uri="http://schemas.openxmlformats.org/drawingml/2006/picture">
+                <pic:pic xmlns:pic="http://schemas.openxmlformats.org/drawingml/2006/picture">
+                  <pic:nvPicPr>
+                    <pic:cNvPr id="0" name="" descr=""/>
+                    <pic:cNvPicPr>
+                      <a:picLocks noChangeAspect="1" noChangeArrowheads="1"/>
+                    </pic:cNvPicPr>
+                  </pic:nvPicPr>
+                  <pic:blipFill>
+                    <a:blip r:embed="rId8" cstate="none"/>
+                    <a:srcRect/>
+                    <a:stretch>
+                      <a:fillRect/>
+                    </a:stretch>
+                  </pic:blipFill>
+                  <pic:spPr bwMode="auto">
+                    <a:xfrm>
+                      <a:off x="0" y="0"/>
+                      <a:ext cx="5715000" cy="3686175"/>
+                    </a:xfrm>
+                    <a:prstGeom prst="rect">
+                      <a:avLst/>
+                    </a:prstGeom>
+                  </pic:spPr>
+                </pic:pic>
+              </a:graphicData>
+            </a:graphic>
+          </wp:inline>
+        </w:drawing>
       </w:r>
     </w:p>
     <w:p>

</xml_diff>

<commit_message>
Shto setin e ri të vlerësimit (56 pyetje, profile testuese), evaluate.py i ri, rregullo lëndët e dyfishta dhe përditëso Kapitullin IV
Co-Authored-By: Claude Sonnet 5.5 <noreply@anthropic.com>
Claude-Session: https://claude.ai/code/session_01BybxYwKhdCxZ7QT7Mx6uTb
</commit_message>
<xml_diff>
--- a/docs/Kapitulli_IV_UETassist.docx
+++ b/docs/Kapitulli_IV_UETassist.docx
@@ -68,12 +68,7 @@
     </w:p>
     <w:p>
       <w:pPr>
-        <w:pBdr>
-          <w:top w:val="single" w:color="999999" w:sz="6" w:space="8"/>
-          <w:bottom w:val="single" w:color="999999" w:sz="6" w:space="8"/>
-          <w:left w:val="single" w:color="999999" w:sz="6" w:space="8"/>
-          <w:right w:val="single" w:color="999999" w:sz="6" w:space="8"/>
-        </w:pBdr>
+        <w:shd w:fill="F3F4F6" w:color="auto" w:val="clear"/>
         <w:spacing w:after="60" w:before="160"/>
         <w:jc w:val="center"/>
       </w:pPr>
@@ -84,8 +79,7 @@
           <w:iCs/>
           <w:sz w:val="22"/>
           <w:szCs w:val="22"/>
-          <w:highlight w:val="yellow"/>
-          <w:highlightCs w:val="yellow"/>
+          <w:shd w:fill="FFFF00" w:color="auto" w:val="clear"/>
         </w:rPr>
         <w:t xml:space="preserve">[Vendos këtu screenshot-in: faqja e hyrjes me skedat Hyr dhe Regjistrohu]</w:t>
       </w:r>
@@ -237,12 +231,7 @@
     </w:p>
     <w:p>
       <w:pPr>
-        <w:pBdr>
-          <w:top w:val="single" w:color="999999" w:sz="6" w:space="8"/>
-          <w:bottom w:val="single" w:color="999999" w:sz="6" w:space="8"/>
-          <w:left w:val="single" w:color="999999" w:sz="6" w:space="8"/>
-          <w:right w:val="single" w:color="999999" w:sz="6" w:space="8"/>
-        </w:pBdr>
+        <w:shd w:fill="F3F4F6" w:color="auto" w:val="clear"/>
         <w:spacing w:after="60" w:before="160"/>
         <w:jc w:val="center"/>
       </w:pPr>
@@ -253,8 +242,7 @@
           <w:iCs/>
           <w:sz w:val="22"/>
           <w:szCs w:val="22"/>
-          <w:highlight w:val="yellow"/>
-          <w:highlightCs w:val="yellow"/>
+          <w:shd w:fill="FFFF00" w:color="auto" w:val="clear"/>
         </w:rPr>
         <w:t xml:space="preserve">[Vendos këtu screenshot-in: formulari Profili im akademik me program, specializim, vit dhe semestër]</w:t>
       </w:r>
@@ -324,12 +312,7 @@
     </w:p>
     <w:p>
       <w:pPr>
-        <w:pBdr>
-          <w:top w:val="single" w:color="999999" w:sz="6" w:space="8"/>
-          <w:bottom w:val="single" w:color="999999" w:sz="6" w:space="8"/>
-          <w:left w:val="single" w:color="999999" w:sz="6" w:space="8"/>
-          <w:right w:val="single" w:color="999999" w:sz="6" w:space="8"/>
-        </w:pBdr>
+        <w:shd w:fill="F3F4F6" w:color="auto" w:val="clear"/>
         <w:spacing w:after="60" w:before="160"/>
         <w:jc w:val="center"/>
       </w:pPr>
@@ -340,8 +323,7 @@
           <w:iCs/>
           <w:sz w:val="22"/>
           <w:szCs w:val="22"/>
-          <w:highlight w:val="yellow"/>
-          <w:highlightCs w:val="yellow"/>
+          <w:shd w:fill="FFFF00" w:color="auto" w:val="clear"/>
         </w:rPr>
         <w:t xml:space="preserve">[Vendos këtu screenshot-in: ekrani kryesor pas hyrjes për studentin aktual]</w:t>
       </w:r>
@@ -543,12 +525,7 @@
     </w:p>
     <w:p>
       <w:pPr>
-        <w:pBdr>
-          <w:top w:val="single" w:color="999999" w:sz="6" w:space="8"/>
-          <w:bottom w:val="single" w:color="999999" w:sz="6" w:space="8"/>
-          <w:left w:val="single" w:color="999999" w:sz="6" w:space="8"/>
-          <w:right w:val="single" w:color="999999" w:sz="6" w:space="8"/>
-        </w:pBdr>
+        <w:shd w:fill="F3F4F6" w:color="auto" w:val="clear"/>
         <w:spacing w:after="60" w:before="160"/>
         <w:jc w:val="center"/>
       </w:pPr>
@@ -559,8 +536,7 @@
           <w:iCs/>
           <w:sz w:val="22"/>
           <w:szCs w:val="22"/>
-          <w:highlight w:val="yellow"/>
-          <w:highlightCs w:val="yellow"/>
+          <w:shd w:fill="FFFF00" w:color="auto" w:val="clear"/>
         </w:rPr>
         <w:t xml:space="preserve">[Vendos këtu screenshot-in: një pyetje ndjekëse e asistentit për studentin potencial]</w:t>
       </w:r>
@@ -631,12 +607,7 @@
     </w:p>
     <w:p>
       <w:pPr>
-        <w:pBdr>
-          <w:top w:val="single" w:color="999999" w:sz="6" w:space="8"/>
-          <w:bottom w:val="single" w:color="999999" w:sz="6" w:space="8"/>
-          <w:left w:val="single" w:color="999999" w:sz="6" w:space="8"/>
-          <w:right w:val="single" w:color="999999" w:sz="6" w:space="8"/>
-        </w:pBdr>
+        <w:shd w:fill="F3F4F6" w:color="auto" w:val="clear"/>
         <w:spacing w:after="60" w:before="160"/>
         <w:jc w:val="center"/>
       </w:pPr>
@@ -647,8 +618,7 @@
           <w:iCs/>
           <w:sz w:val="22"/>
           <w:szCs w:val="22"/>
-          <w:highlight w:val="yellow"/>
-          <w:highlightCs w:val="yellow"/>
+          <w:shd w:fill="FFFF00" w:color="auto" w:val="clear"/>
         </w:rPr>
         <w:t xml:space="preserve">[Vendos këtu screenshot-in: përgjigja e strukturuar me Rekomandimi, Pse, Lëndët, Boshllëqet, Rruga, Karriera dhe Burimet]</w:t>
       </w:r>
@@ -1290,12 +1260,7 @@
     </w:p>
     <w:p>
       <w:pPr>
-        <w:pBdr>
-          <w:top w:val="single" w:color="999999" w:sz="6" w:space="8"/>
-          <w:bottom w:val="single" w:color="999999" w:sz="6" w:space="8"/>
-          <w:left w:val="single" w:color="999999" w:sz="6" w:space="8"/>
-          <w:right w:val="single" w:color="999999" w:sz="6" w:space="8"/>
-        </w:pBdr>
+        <w:shd w:fill="F3F4F6" w:color="auto" w:val="clear"/>
         <w:spacing w:after="60" w:before="160"/>
         <w:jc w:val="center"/>
       </w:pPr>
@@ -1306,8 +1271,7 @@
           <w:iCs/>
           <w:sz w:val="22"/>
           <w:szCs w:val="22"/>
-          <w:highlight w:val="yellow"/>
-          <w:highlightCs w:val="yellow"/>
+          <w:shd w:fill="FFFF00" w:color="auto" w:val="clear"/>
         </w:rPr>
         <w:t xml:space="preserve">[Vendos këtu screenshot-in: kartën e kontekstit dhe listën Lëndët e semestrit]</w:t>
       </w:r>
@@ -1525,12 +1489,7 @@
     </w:p>
     <w:p>
       <w:pPr>
-        <w:pBdr>
-          <w:top w:val="single" w:color="999999" w:sz="6" w:space="8"/>
-          <w:bottom w:val="single" w:color="999999" w:sz="6" w:space="8"/>
-          <w:left w:val="single" w:color="999999" w:sz="6" w:space="8"/>
-          <w:right w:val="single" w:color="999999" w:sz="6" w:space="8"/>
-        </w:pBdr>
+        <w:shd w:fill="F3F4F6" w:color="auto" w:val="clear"/>
         <w:spacing w:after="60" w:before="160"/>
         <w:jc w:val="center"/>
       </w:pPr>
@@ -1541,8 +1500,7 @@
           <w:iCs/>
           <w:sz w:val="22"/>
           <w:szCs w:val="22"/>
-          <w:highlight w:val="yellow"/>
-          <w:highlightCs w:val="yellow"/>
+          <w:shd w:fill="FFFF00" w:color="auto" w:val="clear"/>
         </w:rPr>
         <w:t xml:space="preserve">[Vendos këtu screenshot-in: banner-i Study Mode me butonat Quiz, Ushtrime, Flashcards, Provim prove, Plan përsëritjeje dhe Përmbledhje]</w:t>
       </w:r>
@@ -2401,12 +2359,7 @@
     </w:p>
     <w:p>
       <w:pPr>
-        <w:pBdr>
-          <w:top w:val="single" w:color="999999" w:sz="6" w:space="8"/>
-          <w:bottom w:val="single" w:color="999999" w:sz="6" w:space="8"/>
-          <w:left w:val="single" w:color="999999" w:sz="6" w:space="8"/>
-          <w:right w:val="single" w:color="999999" w:sz="6" w:space="8"/>
-        </w:pBdr>
+        <w:shd w:fill="F3F4F6" w:color="auto" w:val="clear"/>
         <w:spacing w:after="60" w:before="160"/>
         <w:jc w:val="center"/>
       </w:pPr>
@@ -2417,8 +2370,7 @@
           <w:iCs/>
           <w:sz w:val="22"/>
           <w:szCs w:val="22"/>
-          <w:highlight w:val="yellow"/>
-          <w:highlightCs w:val="yellow"/>
+          <w:shd w:fill="FFFF00" w:color="auto" w:val="clear"/>
         </w:rPr>
         <w:t xml:space="preserve">[Vendos këtu screenshot-in: një përgjigje me Burimet dhe kutinë e hapur Burimet e përdorura]</w:t>
       </w:r>
@@ -2502,7 +2454,7 @@
           <w:sz w:val="24"/>
           <w:szCs w:val="24"/>
         </w:rPr>
-        <w:t xml:space="preserve">Për të matur cilësinë e përgjigjeve është përgatitur një set me 25 pyetje testuese, të ndara në katër kategori: lëndë dhe kredite (11 pyetje), profile të programeve (5), punësim (4) dhe pyetje jashtë korpusit (5), për të cilat dokumentet nuk përmbajnë përgjigje. Pyetjet jashtë korpusit shërbejnë për të provuar nëse sistemi refuzon saktë dhe nuk shpik.</w:t>
+        <w:t xml:space="preserve">Për të matur cilësinë e përgjigjeve është përgatitur një set me 56 pyetje testuese, të ndara në dy rrugë ekzekutimi. Në rrugën «RAG» (28 pyetje) pyetja kalon vetëm nëpër rrjedhën standarde të kërkimit dhe gjenerimit. Në rrugën «asistent» (28 pyetje) pyetja kalon nëpër rrjedhën e plotë të aplikacionit: klasifikimin e qëllimit, profilin, rrugën e studentit aktual, Study Mode dhe pyetjet ndjekëse. Nga 56 pyetjet, 42 kanë përgjigje te dokumentet dhe 14 nuk kanë, pra janë pyetje jashtë korpusit ose kurthe, p.sh. një lëndë që nuk ekziston, për të provuar nëse sistemi refuzon saktë dhe nuk shpik.</w:t>
       </w:r>
     </w:p>
     <w:p>
@@ -2535,9 +2487,9 @@
         </w:tblBorders>
       </w:tblPr>
       <w:tblGrid>
-        <w:gridCol w:w="3400"/>
-        <w:gridCol w:w="1500"/>
-        <w:gridCol w:w="4100"/>
+        <w:gridCol w:w="5400"/>
+        <w:gridCol w:w="1000"/>
+        <w:gridCol w:w="2600"/>
       </w:tblGrid>
       <w:tr>
         <w:trPr>
@@ -2545,7 +2497,7 @@
         </w:trPr>
         <w:tc>
           <w:tcPr>
-            <w:tcW w:type="dxa" w:w="3400"/>
+            <w:tcW w:type="dxa" w:w="5400"/>
             <w:tcBorders>
               <w:top w:val="single" w:color="999999" w:sz="4"/>
               <w:left w:val="single" w:color="999999" w:sz="4"/>
@@ -2569,13 +2521,13 @@
                 <w:sz w:val="22"/>
                 <w:szCs w:val="22"/>
               </w:rPr>
-              <w:t xml:space="preserve">Kategoria</w:t>
-            </w:r>
-          </w:p>
-        </w:tc>
-        <w:tc>
-          <w:tcPr>
-            <w:tcW w:type="dxa" w:w="1500"/>
+              <w:t xml:space="preserve">Grupi i pyetjeve</w:t>
+            </w:r>
+          </w:p>
+        </w:tc>
+        <w:tc>
+          <w:tcPr>
+            <w:tcW w:type="dxa" w:w="1000"/>
             <w:tcBorders>
               <w:top w:val="single" w:color="999999" w:sz="4"/>
               <w:left w:val="single" w:color="999999" w:sz="4"/>
@@ -2605,7 +2557,7 @@
         </w:tc>
         <w:tc>
           <w:tcPr>
-            <w:tcW w:type="dxa" w:w="4100"/>
+            <w:tcW w:type="dxa" w:w="2600"/>
             <w:tcBorders>
               <w:top w:val="single" w:color="999999" w:sz="4"/>
               <w:left w:val="single" w:color="999999" w:sz="4"/>
@@ -2629,7 +2581,7 @@
                 <w:sz w:val="22"/>
                 <w:szCs w:val="22"/>
               </w:rPr>
-              <w:t xml:space="preserve">Qëllimi</w:t>
+              <w:t xml:space="preserve">Brenda korpusit</w:t>
             </w:r>
           </w:p>
         </w:tc>
@@ -2637,88 +2589,88 @@
       <w:tr>
         <w:tc>
           <w:tcPr>
-            <w:tcW w:type="dxa" w:w="3400"/>
-            <w:tcBorders>
-              <w:top w:val="single" w:color="999999" w:sz="4"/>
-              <w:left w:val="single" w:color="999999" w:sz="4"/>
-              <w:bottom w:val="single" w:color="999999" w:sz="4"/>
-              <w:right w:val="single" w:color="999999" w:sz="4"/>
-            </w:tcBorders>
-            <w:tcMar>
-              <w:top w:type="dxa" w:w="60"/>
-              <w:left w:type="dxa" w:w="100"/>
-              <w:bottom w:type="dxa" w:w="60"/>
-              <w:right w:type="dxa" w:w="100"/>
-            </w:tcMar>
-          </w:tcPr>
-          <w:p>
-            <w:r>
-              <w:rPr>
-                <w:rFonts w:ascii="Times New Roman" w:cs="Times New Roman" w:eastAsia="Times New Roman" w:hAnsi="Times New Roman"/>
-                <w:b w:val="false"/>
-                <w:bCs w:val="false"/>
-                <w:sz w:val="22"/>
-                <w:szCs w:val="22"/>
-              </w:rPr>
-              <w:t xml:space="preserve">Lëndë dhe kredite</w:t>
-            </w:r>
-          </w:p>
-        </w:tc>
-        <w:tc>
-          <w:tcPr>
-            <w:tcW w:type="dxa" w:w="1500"/>
-            <w:tcBorders>
-              <w:top w:val="single" w:color="999999" w:sz="4"/>
-              <w:left w:val="single" w:color="999999" w:sz="4"/>
-              <w:bottom w:val="single" w:color="999999" w:sz="4"/>
-              <w:right w:val="single" w:color="999999" w:sz="4"/>
-            </w:tcBorders>
-            <w:tcMar>
-              <w:top w:type="dxa" w:w="60"/>
-              <w:left w:type="dxa" w:w="100"/>
-              <w:bottom w:type="dxa" w:w="60"/>
-              <w:right w:type="dxa" w:w="100"/>
-            </w:tcMar>
-          </w:tcPr>
-          <w:p>
-            <w:r>
-              <w:rPr>
-                <w:rFonts w:ascii="Times New Roman" w:cs="Times New Roman" w:eastAsia="Times New Roman" w:hAnsi="Times New Roman"/>
-                <w:b w:val="false"/>
-                <w:bCs w:val="false"/>
-                <w:sz w:val="22"/>
-                <w:szCs w:val="22"/>
-              </w:rPr>
-              <w:t xml:space="preserve">11</w:t>
-            </w:r>
-          </w:p>
-        </w:tc>
-        <w:tc>
-          <w:tcPr>
-            <w:tcW w:type="dxa" w:w="4100"/>
-            <w:tcBorders>
-              <w:top w:val="single" w:color="999999" w:sz="4"/>
-              <w:left w:val="single" w:color="999999" w:sz="4"/>
-              <w:bottom w:val="single" w:color="999999" w:sz="4"/>
-              <w:right w:val="single" w:color="999999" w:sz="4"/>
-            </w:tcBorders>
-            <w:tcMar>
-              <w:top w:type="dxa" w:w="60"/>
-              <w:left w:type="dxa" w:w="100"/>
-              <w:bottom w:type="dxa" w:w="60"/>
-              <w:right w:type="dxa" w:w="100"/>
-            </w:tcMar>
-          </w:tcPr>
-          <w:p>
-            <w:r>
-              <w:rPr>
-                <w:rFonts w:ascii="Times New Roman" w:cs="Times New Roman" w:eastAsia="Times New Roman" w:hAnsi="Times New Roman"/>
-                <w:b w:val="false"/>
-                <w:bCs w:val="false"/>
-                <w:sz w:val="22"/>
-                <w:szCs w:val="22"/>
-              </w:rPr>
-              <w:t xml:space="preserve">Saktësia e lëndëve, ECTS, vitit dhe semestrit</w:t>
+            <w:tcW w:type="dxa" w:w="5400"/>
+            <w:tcBorders>
+              <w:top w:val="single" w:color="999999" w:sz="4"/>
+              <w:left w:val="single" w:color="999999" w:sz="4"/>
+              <w:bottom w:val="single" w:color="999999" w:sz="4"/>
+              <w:right w:val="single" w:color="999999" w:sz="4"/>
+            </w:tcBorders>
+            <w:tcMar>
+              <w:top w:type="dxa" w:w="60"/>
+              <w:left w:type="dxa" w:w="100"/>
+              <w:bottom w:type="dxa" w:w="60"/>
+              <w:right w:type="dxa" w:w="100"/>
+            </w:tcMar>
+          </w:tcPr>
+          <w:p>
+            <w:r>
+              <w:rPr>
+                <w:rFonts w:ascii="Times New Roman" w:cs="Times New Roman" w:eastAsia="Times New Roman" w:hAnsi="Times New Roman"/>
+                <w:b w:val="false"/>
+                <w:bCs w:val="false"/>
+                <w:sz w:val="22"/>
+                <w:szCs w:val="22"/>
+              </w:rPr>
+              <w:t xml:space="preserve">Programe, lëndë dhe punësim (RAG standard)</w:t>
+            </w:r>
+          </w:p>
+        </w:tc>
+        <w:tc>
+          <w:tcPr>
+            <w:tcW w:type="dxa" w:w="1000"/>
+            <w:tcBorders>
+              <w:top w:val="single" w:color="999999" w:sz="4"/>
+              <w:left w:val="single" w:color="999999" w:sz="4"/>
+              <w:bottom w:val="single" w:color="999999" w:sz="4"/>
+              <w:right w:val="single" w:color="999999" w:sz="4"/>
+            </w:tcBorders>
+            <w:tcMar>
+              <w:top w:type="dxa" w:w="60"/>
+              <w:left w:type="dxa" w:w="100"/>
+              <w:bottom w:type="dxa" w:w="60"/>
+              <w:right w:type="dxa" w:w="100"/>
+            </w:tcMar>
+          </w:tcPr>
+          <w:p>
+            <w:r>
+              <w:rPr>
+                <w:rFonts w:ascii="Times New Roman" w:cs="Times New Roman" w:eastAsia="Times New Roman" w:hAnsi="Times New Roman"/>
+                <w:b w:val="false"/>
+                <w:bCs w:val="false"/>
+                <w:sz w:val="22"/>
+                <w:szCs w:val="22"/>
+              </w:rPr>
+              <w:t xml:space="preserve">20</w:t>
+            </w:r>
+          </w:p>
+        </w:tc>
+        <w:tc>
+          <w:tcPr>
+            <w:tcW w:type="dxa" w:w="2600"/>
+            <w:tcBorders>
+              <w:top w:val="single" w:color="999999" w:sz="4"/>
+              <w:left w:val="single" w:color="999999" w:sz="4"/>
+              <w:bottom w:val="single" w:color="999999" w:sz="4"/>
+              <w:right w:val="single" w:color="999999" w:sz="4"/>
+            </w:tcBorders>
+            <w:tcMar>
+              <w:top w:type="dxa" w:w="60"/>
+              <w:left w:type="dxa" w:w="100"/>
+              <w:bottom w:type="dxa" w:w="60"/>
+              <w:right w:type="dxa" w:w="100"/>
+            </w:tcMar>
+          </w:tcPr>
+          <w:p>
+            <w:r>
+              <w:rPr>
+                <w:rFonts w:ascii="Times New Roman" w:cs="Times New Roman" w:eastAsia="Times New Roman" w:hAnsi="Times New Roman"/>
+                <w:b w:val="false"/>
+                <w:bCs w:val="false"/>
+                <w:sz w:val="22"/>
+                <w:szCs w:val="22"/>
+              </w:rPr>
+              <w:t xml:space="preserve">20</w:t>
             </w:r>
           </w:p>
         </w:tc>
@@ -2726,88 +2678,88 @@
       <w:tr>
         <w:tc>
           <w:tcPr>
-            <w:tcW w:type="dxa" w:w="3400"/>
-            <w:tcBorders>
-              <w:top w:val="single" w:color="999999" w:sz="4"/>
-              <w:left w:val="single" w:color="999999" w:sz="4"/>
-              <w:bottom w:val="single" w:color="999999" w:sz="4"/>
-              <w:right w:val="single" w:color="999999" w:sz="4"/>
-            </w:tcBorders>
-            <w:tcMar>
-              <w:top w:type="dxa" w:w="60"/>
-              <w:left w:type="dxa" w:w="100"/>
-              <w:bottom w:type="dxa" w:w="60"/>
-              <w:right w:type="dxa" w:w="100"/>
-            </w:tcMar>
-          </w:tcPr>
-          <w:p>
-            <w:r>
-              <w:rPr>
-                <w:rFonts w:ascii="Times New Roman" w:cs="Times New Roman" w:eastAsia="Times New Roman" w:hAnsi="Times New Roman"/>
-                <w:b w:val="false"/>
-                <w:bCs w:val="false"/>
-                <w:sz w:val="22"/>
-                <w:szCs w:val="22"/>
-              </w:rPr>
-              <w:t xml:space="preserve">Profile të programeve</w:t>
-            </w:r>
-          </w:p>
-        </w:tc>
-        <w:tc>
-          <w:tcPr>
-            <w:tcW w:type="dxa" w:w="1500"/>
-            <w:tcBorders>
-              <w:top w:val="single" w:color="999999" w:sz="4"/>
-              <w:left w:val="single" w:color="999999" w:sz="4"/>
-              <w:bottom w:val="single" w:color="999999" w:sz="4"/>
-              <w:right w:val="single" w:color="999999" w:sz="4"/>
-            </w:tcBorders>
-            <w:tcMar>
-              <w:top w:type="dxa" w:w="60"/>
-              <w:left w:type="dxa" w:w="100"/>
-              <w:bottom w:type="dxa" w:w="60"/>
-              <w:right w:type="dxa" w:w="100"/>
-            </w:tcMar>
-          </w:tcPr>
-          <w:p>
-            <w:r>
-              <w:rPr>
-                <w:rFonts w:ascii="Times New Roman" w:cs="Times New Roman" w:eastAsia="Times New Roman" w:hAnsi="Times New Roman"/>
-                <w:b w:val="false"/>
-                <w:bCs w:val="false"/>
-                <w:sz w:val="22"/>
-                <w:szCs w:val="22"/>
-              </w:rPr>
-              <w:t xml:space="preserve">5</w:t>
-            </w:r>
-          </w:p>
-        </w:tc>
-        <w:tc>
-          <w:tcPr>
-            <w:tcW w:type="dxa" w:w="4100"/>
-            <w:tcBorders>
-              <w:top w:val="single" w:color="999999" w:sz="4"/>
-              <w:left w:val="single" w:color="999999" w:sz="4"/>
-              <w:bottom w:val="single" w:color="999999" w:sz="4"/>
-              <w:right w:val="single" w:color="999999" w:sz="4"/>
-            </w:tcBorders>
-            <w:tcMar>
-              <w:top w:type="dxa" w:w="60"/>
-              <w:left w:type="dxa" w:w="100"/>
-              <w:bottom w:type="dxa" w:w="60"/>
-              <w:right w:type="dxa" w:w="100"/>
-            </w:tcMar>
-          </w:tcPr>
-          <w:p>
-            <w:r>
-              <w:rPr>
-                <w:rFonts w:ascii="Times New Roman" w:cs="Times New Roman" w:eastAsia="Times New Roman" w:hAnsi="Times New Roman"/>
-                <w:b w:val="false"/>
-                <w:bCs w:val="false"/>
-                <w:sz w:val="22"/>
-                <w:szCs w:val="22"/>
-              </w:rPr>
-              <w:t xml:space="preserve">Saktësia e profileve të secilit program</w:t>
+            <w:tcW w:type="dxa" w:w="5400"/>
+            <w:tcBorders>
+              <w:top w:val="single" w:color="999999" w:sz="4"/>
+              <w:left w:val="single" w:color="999999" w:sz="4"/>
+              <w:bottom w:val="single" w:color="999999" w:sz="4"/>
+              <w:right w:val="single" w:color="999999" w:sz="4"/>
+            </w:tcBorders>
+            <w:tcMar>
+              <w:top w:type="dxa" w:w="60"/>
+              <w:left w:type="dxa" w:w="100"/>
+              <w:bottom w:type="dxa" w:w="60"/>
+              <w:right w:type="dxa" w:w="100"/>
+            </w:tcMar>
+          </w:tcPr>
+          <w:p>
+            <w:r>
+              <w:rPr>
+                <w:rFonts w:ascii="Times New Roman" w:cs="Times New Roman" w:eastAsia="Times New Roman" w:hAnsi="Times New Roman"/>
+                <w:b w:val="false"/>
+                <w:bCs w:val="false"/>
+                <w:sz w:val="22"/>
+                <w:szCs w:val="22"/>
+              </w:rPr>
+              <w:t xml:space="preserve">Pyetje jashtë korpusit dhe kurthe (RAG standard)</w:t>
+            </w:r>
+          </w:p>
+        </w:tc>
+        <w:tc>
+          <w:tcPr>
+            <w:tcW w:type="dxa" w:w="1000"/>
+            <w:tcBorders>
+              <w:top w:val="single" w:color="999999" w:sz="4"/>
+              <w:left w:val="single" w:color="999999" w:sz="4"/>
+              <w:bottom w:val="single" w:color="999999" w:sz="4"/>
+              <w:right w:val="single" w:color="999999" w:sz="4"/>
+            </w:tcBorders>
+            <w:tcMar>
+              <w:top w:type="dxa" w:w="60"/>
+              <w:left w:type="dxa" w:w="100"/>
+              <w:bottom w:type="dxa" w:w="60"/>
+              <w:right w:type="dxa" w:w="100"/>
+            </w:tcMar>
+          </w:tcPr>
+          <w:p>
+            <w:r>
+              <w:rPr>
+                <w:rFonts w:ascii="Times New Roman" w:cs="Times New Roman" w:eastAsia="Times New Roman" w:hAnsi="Times New Roman"/>
+                <w:b w:val="false"/>
+                <w:bCs w:val="false"/>
+                <w:sz w:val="22"/>
+                <w:szCs w:val="22"/>
+              </w:rPr>
+              <w:t xml:space="preserve">8</w:t>
+            </w:r>
+          </w:p>
+        </w:tc>
+        <w:tc>
+          <w:tcPr>
+            <w:tcW w:type="dxa" w:w="2600"/>
+            <w:tcBorders>
+              <w:top w:val="single" w:color="999999" w:sz="4"/>
+              <w:left w:val="single" w:color="999999" w:sz="4"/>
+              <w:bottom w:val="single" w:color="999999" w:sz="4"/>
+              <w:right w:val="single" w:color="999999" w:sz="4"/>
+            </w:tcBorders>
+            <w:tcMar>
+              <w:top w:type="dxa" w:w="60"/>
+              <w:left w:type="dxa" w:w="100"/>
+              <w:bottom w:type="dxa" w:w="60"/>
+              <w:right w:type="dxa" w:w="100"/>
+            </w:tcMar>
+          </w:tcPr>
+          <w:p>
+            <w:r>
+              <w:rPr>
+                <w:rFonts w:ascii="Times New Roman" w:cs="Times New Roman" w:eastAsia="Times New Roman" w:hAnsi="Times New Roman"/>
+                <w:b w:val="false"/>
+                <w:bCs w:val="false"/>
+                <w:sz w:val="22"/>
+                <w:szCs w:val="22"/>
+              </w:rPr>
+              <w:t xml:space="preserve">0</w:t>
             </w:r>
           </w:p>
         </w:tc>
@@ -2815,88 +2767,88 @@
       <w:tr>
         <w:tc>
           <w:tcPr>
-            <w:tcW w:type="dxa" w:w="3400"/>
-            <w:tcBorders>
-              <w:top w:val="single" w:color="999999" w:sz="4"/>
-              <w:left w:val="single" w:color="999999" w:sz="4"/>
-              <w:bottom w:val="single" w:color="999999" w:sz="4"/>
-              <w:right w:val="single" w:color="999999" w:sz="4"/>
-            </w:tcBorders>
-            <w:tcMar>
-              <w:top w:type="dxa" w:w="60"/>
-              <w:left w:type="dxa" w:w="100"/>
-              <w:bottom w:type="dxa" w:w="60"/>
-              <w:right w:type="dxa" w:w="100"/>
-            </w:tcMar>
-          </w:tcPr>
-          <w:p>
-            <w:r>
-              <w:rPr>
-                <w:rFonts w:ascii="Times New Roman" w:cs="Times New Roman" w:eastAsia="Times New Roman" w:hAnsi="Times New Roman"/>
-                <w:b w:val="false"/>
-                <w:bCs w:val="false"/>
-                <w:sz w:val="22"/>
-                <w:szCs w:val="22"/>
-              </w:rPr>
-              <w:t xml:space="preserve">Punësim</w:t>
-            </w:r>
-          </w:p>
-        </w:tc>
-        <w:tc>
-          <w:tcPr>
-            <w:tcW w:type="dxa" w:w="1500"/>
-            <w:tcBorders>
-              <w:top w:val="single" w:color="999999" w:sz="4"/>
-              <w:left w:val="single" w:color="999999" w:sz="4"/>
-              <w:bottom w:val="single" w:color="999999" w:sz="4"/>
-              <w:right w:val="single" w:color="999999" w:sz="4"/>
-            </w:tcBorders>
-            <w:tcMar>
-              <w:top w:type="dxa" w:w="60"/>
-              <w:left w:type="dxa" w:w="100"/>
-              <w:bottom w:type="dxa" w:w="60"/>
-              <w:right w:type="dxa" w:w="100"/>
-            </w:tcMar>
-          </w:tcPr>
-          <w:p>
-            <w:r>
-              <w:rPr>
-                <w:rFonts w:ascii="Times New Roman" w:cs="Times New Roman" w:eastAsia="Times New Roman" w:hAnsi="Times New Roman"/>
-                <w:b w:val="false"/>
-                <w:bCs w:val="false"/>
-                <w:sz w:val="22"/>
-                <w:szCs w:val="22"/>
-              </w:rPr>
-              <w:t xml:space="preserve">4</w:t>
-            </w:r>
-          </w:p>
-        </w:tc>
-        <w:tc>
-          <w:tcPr>
-            <w:tcW w:type="dxa" w:w="4100"/>
-            <w:tcBorders>
-              <w:top w:val="single" w:color="999999" w:sz="4"/>
-              <w:left w:val="single" w:color="999999" w:sz="4"/>
-              <w:bottom w:val="single" w:color="999999" w:sz="4"/>
-              <w:right w:val="single" w:color="999999" w:sz="4"/>
-            </w:tcBorders>
-            <w:tcMar>
-              <w:top w:type="dxa" w:w="60"/>
-              <w:left w:type="dxa" w:w="100"/>
-              <w:bottom w:type="dxa" w:w="60"/>
-              <w:right w:type="dxa" w:w="100"/>
-            </w:tcMar>
-          </w:tcPr>
-          <w:p>
-            <w:r>
-              <w:rPr>
-                <w:rFonts w:ascii="Times New Roman" w:cs="Times New Roman" w:eastAsia="Times New Roman" w:hAnsi="Times New Roman"/>
-                <w:b w:val="false"/>
-                <w:bCs w:val="false"/>
-                <w:sz w:val="22"/>
-                <w:szCs w:val="22"/>
-              </w:rPr>
-              <w:t xml:space="preserve">Mundësitë e punësimit të cituara nga dokumentet</w:t>
+            <w:tcW w:type="dxa" w:w="5400"/>
+            <w:tcBorders>
+              <w:top w:val="single" w:color="999999" w:sz="4"/>
+              <w:left w:val="single" w:color="999999" w:sz="4"/>
+              <w:bottom w:val="single" w:color="999999" w:sz="4"/>
+              <w:right w:val="single" w:color="999999" w:sz="4"/>
+            </w:tcBorders>
+            <w:tcMar>
+              <w:top w:type="dxa" w:w="60"/>
+              <w:left w:type="dxa" w:w="100"/>
+              <w:bottom w:type="dxa" w:w="60"/>
+              <w:right w:type="dxa" w:w="100"/>
+            </w:tcMar>
+          </w:tcPr>
+          <w:p>
+            <w:r>
+              <w:rPr>
+                <w:rFonts w:ascii="Times New Roman" w:cs="Times New Roman" w:eastAsia="Times New Roman" w:hAnsi="Times New Roman"/>
+                <w:b w:val="false"/>
+                <w:bCs w:val="false"/>
+                <w:sz w:val="22"/>
+                <w:szCs w:val="22"/>
+              </w:rPr>
+              <w:t xml:space="preserve">Studenti potencial: rekomandim, krahasim, boshllëqe, «po sikur», rrugë akademike, pyetje ndjekëse</w:t>
+            </w:r>
+          </w:p>
+        </w:tc>
+        <w:tc>
+          <w:tcPr>
+            <w:tcW w:type="dxa" w:w="1000"/>
+            <w:tcBorders>
+              <w:top w:val="single" w:color="999999" w:sz="4"/>
+              <w:left w:val="single" w:color="999999" w:sz="4"/>
+              <w:bottom w:val="single" w:color="999999" w:sz="4"/>
+              <w:right w:val="single" w:color="999999" w:sz="4"/>
+            </w:tcBorders>
+            <w:tcMar>
+              <w:top w:type="dxa" w:w="60"/>
+              <w:left w:type="dxa" w:w="100"/>
+              <w:bottom w:type="dxa" w:w="60"/>
+              <w:right w:type="dxa" w:w="100"/>
+            </w:tcMar>
+          </w:tcPr>
+          <w:p>
+            <w:r>
+              <w:rPr>
+                <w:rFonts w:ascii="Times New Roman" w:cs="Times New Roman" w:eastAsia="Times New Roman" w:hAnsi="Times New Roman"/>
+                <w:b w:val="false"/>
+                <w:bCs w:val="false"/>
+                <w:sz w:val="22"/>
+                <w:szCs w:val="22"/>
+              </w:rPr>
+              <w:t xml:space="preserve">7</w:t>
+            </w:r>
+          </w:p>
+        </w:tc>
+        <w:tc>
+          <w:tcPr>
+            <w:tcW w:type="dxa" w:w="2600"/>
+            <w:tcBorders>
+              <w:top w:val="single" w:color="999999" w:sz="4"/>
+              <w:left w:val="single" w:color="999999" w:sz="4"/>
+              <w:bottom w:val="single" w:color="999999" w:sz="4"/>
+              <w:right w:val="single" w:color="999999" w:sz="4"/>
+            </w:tcBorders>
+            <w:tcMar>
+              <w:top w:type="dxa" w:w="60"/>
+              <w:left w:type="dxa" w:w="100"/>
+              <w:bottom w:type="dxa" w:w="60"/>
+              <w:right w:type="dxa" w:w="100"/>
+            </w:tcMar>
+          </w:tcPr>
+          <w:p>
+            <w:r>
+              <w:rPr>
+                <w:rFonts w:ascii="Times New Roman" w:cs="Times New Roman" w:eastAsia="Times New Roman" w:hAnsi="Times New Roman"/>
+                <w:b w:val="false"/>
+                <w:bCs w:val="false"/>
+                <w:sz w:val="22"/>
+                <w:szCs w:val="22"/>
+              </w:rPr>
+              <w:t xml:space="preserve">7</w:t>
             </w:r>
           </w:p>
         </w:tc>
@@ -2904,88 +2856,88 @@
       <w:tr>
         <w:tc>
           <w:tcPr>
-            <w:tcW w:type="dxa" w:w="3400"/>
-            <w:tcBorders>
-              <w:top w:val="single" w:color="999999" w:sz="4"/>
-              <w:left w:val="single" w:color="999999" w:sz="4"/>
-              <w:bottom w:val="single" w:color="999999" w:sz="4"/>
-              <w:right w:val="single" w:color="999999" w:sz="4"/>
-            </w:tcBorders>
-            <w:tcMar>
-              <w:top w:type="dxa" w:w="60"/>
-              <w:left w:type="dxa" w:w="100"/>
-              <w:bottom w:type="dxa" w:w="60"/>
-              <w:right w:type="dxa" w:w="100"/>
-            </w:tcMar>
-          </w:tcPr>
-          <w:p>
-            <w:r>
-              <w:rPr>
-                <w:rFonts w:ascii="Times New Roman" w:cs="Times New Roman" w:eastAsia="Times New Roman" w:hAnsi="Times New Roman"/>
-                <w:b w:val="false"/>
-                <w:bCs w:val="false"/>
-                <w:sz w:val="22"/>
-                <w:szCs w:val="22"/>
-              </w:rPr>
-              <w:t xml:space="preserve">Jashtë korpusit</w:t>
-            </w:r>
-          </w:p>
-        </w:tc>
-        <w:tc>
-          <w:tcPr>
-            <w:tcW w:type="dxa" w:w="1500"/>
-            <w:tcBorders>
-              <w:top w:val="single" w:color="999999" w:sz="4"/>
-              <w:left w:val="single" w:color="999999" w:sz="4"/>
-              <w:bottom w:val="single" w:color="999999" w:sz="4"/>
-              <w:right w:val="single" w:color="999999" w:sz="4"/>
-            </w:tcBorders>
-            <w:tcMar>
-              <w:top w:type="dxa" w:w="60"/>
-              <w:left w:type="dxa" w:w="100"/>
-              <w:bottom w:type="dxa" w:w="60"/>
-              <w:right w:type="dxa" w:w="100"/>
-            </w:tcMar>
-          </w:tcPr>
-          <w:p>
-            <w:r>
-              <w:rPr>
-                <w:rFonts w:ascii="Times New Roman" w:cs="Times New Roman" w:eastAsia="Times New Roman" w:hAnsi="Times New Roman"/>
-                <w:b w:val="false"/>
-                <w:bCs w:val="false"/>
-                <w:sz w:val="22"/>
-                <w:szCs w:val="22"/>
-              </w:rPr>
-              <w:t xml:space="preserve">5</w:t>
-            </w:r>
-          </w:p>
-        </w:tc>
-        <w:tc>
-          <w:tcPr>
-            <w:tcW w:type="dxa" w:w="4100"/>
-            <w:tcBorders>
-              <w:top w:val="single" w:color="999999" w:sz="4"/>
-              <w:left w:val="single" w:color="999999" w:sz="4"/>
-              <w:bottom w:val="single" w:color="999999" w:sz="4"/>
-              <w:right w:val="single" w:color="999999" w:sz="4"/>
-            </w:tcBorders>
-            <w:tcMar>
-              <w:top w:type="dxa" w:w="60"/>
-              <w:left w:type="dxa" w:w="100"/>
-              <w:bottom w:type="dxa" w:w="60"/>
-              <w:right w:type="dxa" w:w="100"/>
-            </w:tcMar>
-          </w:tcPr>
-          <w:p>
-            <w:r>
-              <w:rPr>
-                <w:rFonts w:ascii="Times New Roman" w:cs="Times New Roman" w:eastAsia="Times New Roman" w:hAnsi="Times New Roman"/>
-                <w:b w:val="false"/>
-                <w:bCs w:val="false"/>
-                <w:sz w:val="22"/>
-                <w:szCs w:val="22"/>
-              </w:rPr>
-              <w:t xml:space="preserve">Refuzimi i saktë kur informacioni mungon</w:t>
+            <w:tcW w:type="dxa" w:w="5400"/>
+            <w:tcBorders>
+              <w:top w:val="single" w:color="999999" w:sz="4"/>
+              <w:left w:val="single" w:color="999999" w:sz="4"/>
+              <w:bottom w:val="single" w:color="999999" w:sz="4"/>
+              <w:right w:val="single" w:color="999999" w:sz="4"/>
+            </w:tcBorders>
+            <w:tcMar>
+              <w:top w:type="dxa" w:w="60"/>
+              <w:left w:type="dxa" w:w="100"/>
+              <w:bottom w:type="dxa" w:w="60"/>
+              <w:right w:type="dxa" w:w="100"/>
+            </w:tcMar>
+          </w:tcPr>
+          <w:p>
+            <w:r>
+              <w:rPr>
+                <w:rFonts w:ascii="Times New Roman" w:cs="Times New Roman" w:eastAsia="Times New Roman" w:hAnsi="Times New Roman"/>
+                <w:b w:val="false"/>
+                <w:bCs w:val="false"/>
+                <w:sz w:val="22"/>
+                <w:szCs w:val="22"/>
+              </w:rPr>
+              <w:t xml:space="preserve">Biseda: kontekst, përshëndetje, pranim</w:t>
+            </w:r>
+          </w:p>
+        </w:tc>
+        <w:tc>
+          <w:tcPr>
+            <w:tcW w:type="dxa" w:w="1000"/>
+            <w:tcBorders>
+              <w:top w:val="single" w:color="999999" w:sz="4"/>
+              <w:left w:val="single" w:color="999999" w:sz="4"/>
+              <w:bottom w:val="single" w:color="999999" w:sz="4"/>
+              <w:right w:val="single" w:color="999999" w:sz="4"/>
+            </w:tcBorders>
+            <w:tcMar>
+              <w:top w:type="dxa" w:w="60"/>
+              <w:left w:type="dxa" w:w="100"/>
+              <w:bottom w:type="dxa" w:w="60"/>
+              <w:right w:type="dxa" w:w="100"/>
+            </w:tcMar>
+          </w:tcPr>
+          <w:p>
+            <w:r>
+              <w:rPr>
+                <w:rFonts w:ascii="Times New Roman" w:cs="Times New Roman" w:eastAsia="Times New Roman" w:hAnsi="Times New Roman"/>
+                <w:b w:val="false"/>
+                <w:bCs w:val="false"/>
+                <w:sz w:val="22"/>
+                <w:szCs w:val="22"/>
+              </w:rPr>
+              <w:t xml:space="preserve">3</w:t>
+            </w:r>
+          </w:p>
+        </w:tc>
+        <w:tc>
+          <w:tcPr>
+            <w:tcW w:type="dxa" w:w="2600"/>
+            <w:tcBorders>
+              <w:top w:val="single" w:color="999999" w:sz="4"/>
+              <w:left w:val="single" w:color="999999" w:sz="4"/>
+              <w:bottom w:val="single" w:color="999999" w:sz="4"/>
+              <w:right w:val="single" w:color="999999" w:sz="4"/>
+            </w:tcBorders>
+            <w:tcMar>
+              <w:top w:type="dxa" w:w="60"/>
+              <w:left w:type="dxa" w:w="100"/>
+              <w:bottom w:type="dxa" w:w="60"/>
+              <w:right w:type="dxa" w:w="100"/>
+            </w:tcMar>
+          </w:tcPr>
+          <w:p>
+            <w:r>
+              <w:rPr>
+                <w:rFonts w:ascii="Times New Roman" w:cs="Times New Roman" w:eastAsia="Times New Roman" w:hAnsi="Times New Roman"/>
+                <w:b w:val="false"/>
+                <w:bCs w:val="false"/>
+                <w:sz w:val="22"/>
+                <w:szCs w:val="22"/>
+              </w:rPr>
+              <w:t xml:space="preserve">2</w:t>
             </w:r>
           </w:p>
         </w:tc>
@@ -2993,7 +2945,185 @@
       <w:tr>
         <w:tc>
           <w:tcPr>
-            <w:tcW w:type="dxa" w:w="3400"/>
+            <w:tcW w:type="dxa" w:w="5400"/>
+            <w:tcBorders>
+              <w:top w:val="single" w:color="999999" w:sz="4"/>
+              <w:left w:val="single" w:color="999999" w:sz="4"/>
+              <w:bottom w:val="single" w:color="999999" w:sz="4"/>
+              <w:right w:val="single" w:color="999999" w:sz="4"/>
+            </w:tcBorders>
+            <w:tcMar>
+              <w:top w:type="dxa" w:w="60"/>
+              <w:left w:type="dxa" w:w="100"/>
+              <w:bottom w:type="dxa" w:w="60"/>
+              <w:right w:type="dxa" w:w="100"/>
+            </w:tcMar>
+          </w:tcPr>
+          <w:p>
+            <w:r>
+              <w:rPr>
+                <w:rFonts w:ascii="Times New Roman" w:cs="Times New Roman" w:eastAsia="Times New Roman" w:hAnsi="Times New Roman"/>
+                <w:b w:val="false"/>
+                <w:bCs w:val="false"/>
+                <w:sz w:val="22"/>
+                <w:szCs w:val="22"/>
+              </w:rPr>
+              <w:t xml:space="preserve">Studenti aktual: lëndët dhe informacioni akademik</w:t>
+            </w:r>
+          </w:p>
+        </w:tc>
+        <w:tc>
+          <w:tcPr>
+            <w:tcW w:type="dxa" w:w="1000"/>
+            <w:tcBorders>
+              <w:top w:val="single" w:color="999999" w:sz="4"/>
+              <w:left w:val="single" w:color="999999" w:sz="4"/>
+              <w:bottom w:val="single" w:color="999999" w:sz="4"/>
+              <w:right w:val="single" w:color="999999" w:sz="4"/>
+            </w:tcBorders>
+            <w:tcMar>
+              <w:top w:type="dxa" w:w="60"/>
+              <w:left w:type="dxa" w:w="100"/>
+              <w:bottom w:type="dxa" w:w="60"/>
+              <w:right w:type="dxa" w:w="100"/>
+            </w:tcMar>
+          </w:tcPr>
+          <w:p>
+            <w:r>
+              <w:rPr>
+                <w:rFonts w:ascii="Times New Roman" w:cs="Times New Roman" w:eastAsia="Times New Roman" w:hAnsi="Times New Roman"/>
+                <w:b w:val="false"/>
+                <w:bCs w:val="false"/>
+                <w:sz w:val="22"/>
+                <w:szCs w:val="22"/>
+              </w:rPr>
+              <w:t xml:space="preserve">8</w:t>
+            </w:r>
+          </w:p>
+        </w:tc>
+        <w:tc>
+          <w:tcPr>
+            <w:tcW w:type="dxa" w:w="2600"/>
+            <w:tcBorders>
+              <w:top w:val="single" w:color="999999" w:sz="4"/>
+              <w:left w:val="single" w:color="999999" w:sz="4"/>
+              <w:bottom w:val="single" w:color="999999" w:sz="4"/>
+              <w:right w:val="single" w:color="999999" w:sz="4"/>
+            </w:tcBorders>
+            <w:tcMar>
+              <w:top w:type="dxa" w:w="60"/>
+              <w:left w:type="dxa" w:w="100"/>
+              <w:bottom w:type="dxa" w:w="60"/>
+              <w:right w:type="dxa" w:w="100"/>
+            </w:tcMar>
+          </w:tcPr>
+          <w:p>
+            <w:r>
+              <w:rPr>
+                <w:rFonts w:ascii="Times New Roman" w:cs="Times New Roman" w:eastAsia="Times New Roman" w:hAnsi="Times New Roman"/>
+                <w:b w:val="false"/>
+                <w:bCs w:val="false"/>
+                <w:sz w:val="22"/>
+                <w:szCs w:val="22"/>
+              </w:rPr>
+              <w:t xml:space="preserve">6</w:t>
+            </w:r>
+          </w:p>
+        </w:tc>
+      </w:tr>
+      <w:tr>
+        <w:tc>
+          <w:tcPr>
+            <w:tcW w:type="dxa" w:w="5400"/>
+            <w:tcBorders>
+              <w:top w:val="single" w:color="999999" w:sz="4"/>
+              <w:left w:val="single" w:color="999999" w:sz="4"/>
+              <w:bottom w:val="single" w:color="999999" w:sz="4"/>
+              <w:right w:val="single" w:color="999999" w:sz="4"/>
+            </w:tcBorders>
+            <w:tcMar>
+              <w:top w:type="dxa" w:w="60"/>
+              <w:left w:type="dxa" w:w="100"/>
+              <w:bottom w:type="dxa" w:w="60"/>
+              <w:right w:type="dxa" w:w="100"/>
+            </w:tcMar>
+          </w:tcPr>
+          <w:p>
+            <w:r>
+              <w:rPr>
+                <w:rFonts w:ascii="Times New Roman" w:cs="Times New Roman" w:eastAsia="Times New Roman" w:hAnsi="Times New Roman"/>
+                <w:b w:val="false"/>
+                <w:bCs w:val="false"/>
+                <w:sz w:val="22"/>
+                <w:szCs w:val="22"/>
+              </w:rPr>
+              <w:t xml:space="preserve">Study Mode (shpjegim, quiz, flashcards, provim prove, pa material)</w:t>
+            </w:r>
+          </w:p>
+        </w:tc>
+        <w:tc>
+          <w:tcPr>
+            <w:tcW w:type="dxa" w:w="1000"/>
+            <w:tcBorders>
+              <w:top w:val="single" w:color="999999" w:sz="4"/>
+              <w:left w:val="single" w:color="999999" w:sz="4"/>
+              <w:bottom w:val="single" w:color="999999" w:sz="4"/>
+              <w:right w:val="single" w:color="999999" w:sz="4"/>
+            </w:tcBorders>
+            <w:tcMar>
+              <w:top w:type="dxa" w:w="60"/>
+              <w:left w:type="dxa" w:w="100"/>
+              <w:bottom w:type="dxa" w:w="60"/>
+              <w:right w:type="dxa" w:w="100"/>
+            </w:tcMar>
+          </w:tcPr>
+          <w:p>
+            <w:r>
+              <w:rPr>
+                <w:rFonts w:ascii="Times New Roman" w:cs="Times New Roman" w:eastAsia="Times New Roman" w:hAnsi="Times New Roman"/>
+                <w:b w:val="false"/>
+                <w:bCs w:val="false"/>
+                <w:sz w:val="22"/>
+                <w:szCs w:val="22"/>
+              </w:rPr>
+              <w:t xml:space="preserve">10</w:t>
+            </w:r>
+          </w:p>
+        </w:tc>
+        <w:tc>
+          <w:tcPr>
+            <w:tcW w:type="dxa" w:w="2600"/>
+            <w:tcBorders>
+              <w:top w:val="single" w:color="999999" w:sz="4"/>
+              <w:left w:val="single" w:color="999999" w:sz="4"/>
+              <w:bottom w:val="single" w:color="999999" w:sz="4"/>
+              <w:right w:val="single" w:color="999999" w:sz="4"/>
+            </w:tcBorders>
+            <w:tcMar>
+              <w:top w:type="dxa" w:w="60"/>
+              <w:left w:type="dxa" w:w="100"/>
+              <w:bottom w:type="dxa" w:w="60"/>
+              <w:right w:type="dxa" w:w="100"/>
+            </w:tcMar>
+          </w:tcPr>
+          <w:p>
+            <w:r>
+              <w:rPr>
+                <w:rFonts w:ascii="Times New Roman" w:cs="Times New Roman" w:eastAsia="Times New Roman" w:hAnsi="Times New Roman"/>
+                <w:b w:val="false"/>
+                <w:bCs w:val="false"/>
+                <w:sz w:val="22"/>
+                <w:szCs w:val="22"/>
+              </w:rPr>
+              <w:t xml:space="preserve">7</w:t>
+            </w:r>
+          </w:p>
+        </w:tc>
+      </w:tr>
+      <w:tr>
+        <w:tc>
+          <w:tcPr>
+            <w:tcW w:type="dxa" w:w="5400"/>
             <w:tcBorders>
               <w:top w:val="single" w:color="999999" w:sz="4"/>
               <w:left w:val="single" w:color="999999" w:sz="4"/>
@@ -3022,50 +3152,61 @@
         </w:tc>
         <w:tc>
           <w:tcPr>
-            <w:tcW w:type="dxa" w:w="1500"/>
-            <w:tcBorders>
-              <w:top w:val="single" w:color="999999" w:sz="4"/>
-              <w:left w:val="single" w:color="999999" w:sz="4"/>
-              <w:bottom w:val="single" w:color="999999" w:sz="4"/>
-              <w:right w:val="single" w:color="999999" w:sz="4"/>
-            </w:tcBorders>
-            <w:tcMar>
-              <w:top w:type="dxa" w:w="60"/>
-              <w:left w:type="dxa" w:w="100"/>
-              <w:bottom w:type="dxa" w:w="60"/>
-              <w:right w:type="dxa" w:w="100"/>
-            </w:tcMar>
-          </w:tcPr>
-          <w:p>
-            <w:r>
-              <w:rPr>
-                <w:rFonts w:ascii="Times New Roman" w:cs="Times New Roman" w:eastAsia="Times New Roman" w:hAnsi="Times New Roman"/>
-                <w:b w:val="false"/>
-                <w:bCs w:val="false"/>
-                <w:sz w:val="22"/>
-                <w:szCs w:val="22"/>
-              </w:rPr>
-              <w:t xml:space="preserve">25</w:t>
-            </w:r>
-          </w:p>
-        </w:tc>
-        <w:tc>
-          <w:tcPr>
-            <w:tcW w:type="dxa" w:w="4100"/>
-            <w:tcBorders>
-              <w:top w:val="single" w:color="999999" w:sz="4"/>
-              <w:left w:val="single" w:color="999999" w:sz="4"/>
-              <w:bottom w:val="single" w:color="999999" w:sz="4"/>
-              <w:right w:val="single" w:color="999999" w:sz="4"/>
-            </w:tcBorders>
-            <w:tcMar>
-              <w:top w:type="dxa" w:w="60"/>
-              <w:left w:type="dxa" w:w="100"/>
-              <w:bottom w:type="dxa" w:w="60"/>
-              <w:right w:type="dxa" w:w="100"/>
-            </w:tcMar>
-          </w:tcPr>
-          <w:p/>
+            <w:tcW w:type="dxa" w:w="1000"/>
+            <w:tcBorders>
+              <w:top w:val="single" w:color="999999" w:sz="4"/>
+              <w:left w:val="single" w:color="999999" w:sz="4"/>
+              <w:bottom w:val="single" w:color="999999" w:sz="4"/>
+              <w:right w:val="single" w:color="999999" w:sz="4"/>
+            </w:tcBorders>
+            <w:tcMar>
+              <w:top w:type="dxa" w:w="60"/>
+              <w:left w:type="dxa" w:w="100"/>
+              <w:bottom w:type="dxa" w:w="60"/>
+              <w:right w:type="dxa" w:w="100"/>
+            </w:tcMar>
+          </w:tcPr>
+          <w:p>
+            <w:r>
+              <w:rPr>
+                <w:rFonts w:ascii="Times New Roman" w:cs="Times New Roman" w:eastAsia="Times New Roman" w:hAnsi="Times New Roman"/>
+                <w:b w:val="false"/>
+                <w:bCs w:val="false"/>
+                <w:sz w:val="22"/>
+                <w:szCs w:val="22"/>
+              </w:rPr>
+              <w:t xml:space="preserve">56</w:t>
+            </w:r>
+          </w:p>
+        </w:tc>
+        <w:tc>
+          <w:tcPr>
+            <w:tcW w:type="dxa" w:w="2600"/>
+            <w:tcBorders>
+              <w:top w:val="single" w:color="999999" w:sz="4"/>
+              <w:left w:val="single" w:color="999999" w:sz="4"/>
+              <w:bottom w:val="single" w:color="999999" w:sz="4"/>
+              <w:right w:val="single" w:color="999999" w:sz="4"/>
+            </w:tcBorders>
+            <w:tcMar>
+              <w:top w:type="dxa" w:w="60"/>
+              <w:left w:type="dxa" w:w="100"/>
+              <w:bottom w:type="dxa" w:w="60"/>
+              <w:right w:type="dxa" w:w="100"/>
+            </w:tcMar>
+          </w:tcPr>
+          <w:p>
+            <w:r>
+              <w:rPr>
+                <w:rFonts w:ascii="Times New Roman" w:cs="Times New Roman" w:eastAsia="Times New Roman" w:hAnsi="Times New Roman"/>
+                <w:b w:val="false"/>
+                <w:bCs w:val="false"/>
+                <w:sz w:val="22"/>
+                <w:szCs w:val="22"/>
+              </w:rPr>
+              <w:t xml:space="preserve">42</w:t>
+            </w:r>
+          </w:p>
         </w:tc>
       </w:tr>
     </w:tbl>
@@ -3086,7 +3227,22 @@
           <w:sz w:val="24"/>
           <w:szCs w:val="24"/>
         </w:rPr>
-        <w:t xml:space="preserve">Një skript i dedikuar ekzekuton çdo pyetje dhe ruan përgjigjen, burimet, kohën e përgjigjes dhe faktin nëse sistemi refuzoi automatikisht. Pastaj përgjigjet vlerësohen manualisht sipas dy kritereve: saktësisë («e saktë», «pjesërisht e saktë» ose «e pasaktë») dhe nëse burimi i shfaqur e mbështet realisht përgjigjen. Metrikat që ndiqen janë saktësia e përgjigjeve brenda korpusit, përqindja e refuzimeve të sakta për pyetjet jashtë korpusit, përqindja e refuzimeve të gabuara për pyetjet brenda korpusit dhe koha mesatare e përgjigjes.</w:t>
+        <w:t xml:space="preserve">Pyetjet e rrugës së asistentit ekzekutohen me profile testuese të përcaktuara paraprakisht: tre profile të studentit potencial (një për të dhënat, një për financën dhe një bosh, që teston pyetjet ndjekëse) dhe tre profile të studentit aktual (Teknologji Informacioni në vitin 2 semestri 2, Teknologji Informacioni në vitin 1 semestri 1, dhe Financë në vitin 1 semestri 2). Disa pyetje kanë edhe një pyetje paraprake, që simulon një bisedë me dy hapa dhe teston ruajtjen e kontekstit, p.sh. «Çfarë është Virtual DOM në React?» e ndjekur nga «Po hooks?». Çdo pyetje nis me sesion të ri, pa historik nga pyetjet e tjera.</w:t>
+      </w:r>
+    </w:p>
+    <w:p>
+      <w:pPr>
+        <w:spacing w:after="120" w:line="360"/>
+        <w:ind w:firstLine="567"/>
+        <w:jc w:val="both"/>
+      </w:pPr>
+      <w:r>
+        <w:rPr>
+          <w:rFonts w:ascii="Times New Roman" w:cs="Times New Roman" w:eastAsia="Times New Roman" w:hAnsi="Times New Roman"/>
+          <w:sz w:val="24"/>
+          <w:szCs w:val="24"/>
+        </w:rPr>
+        <w:t xml:space="preserve">Një skript i dedikuar ekzekuton çdo pyetje dhe ruan përgjigjen, burimet, qëllimin e klasifikuar, faktin nëse asistenti bëri pyetje ndjekëse, kohën e përgjigjes dhe faktin nëse sistemi refuzoi automatikisht. Pastaj përgjigjet vlerësohen manualisht sipas katër kritereve: saktësisë («e saktë», «pjesërisht e saktë» ose «e pasaktë»), nëse burimi i shfaqur e mbështet realisht përgjigjen, nëse përgjigjja përmban halucinacion (emra, numra ose ECTS që nuk gjenden te dokumentet) dhe, për pyetjet me profil, nëse përgjigjja është e personalizuar. Për çdo pyetje setit i bashkëngjitet një përgjigje e pritur, që vlerësimi të jetë i qëndrueshëm.</w:t>
       </w:r>
     </w:p>
     <w:p>
@@ -3119,9 +3275,9 @@
         </w:tblBorders>
       </w:tblPr>
       <w:tblGrid>
-        <w:gridCol w:w="4200"/>
-        <w:gridCol w:w="2200"/>
-        <w:gridCol w:w="2600"/>
+        <w:gridCol w:w="4600"/>
+        <w:gridCol w:w="1900"/>
+        <w:gridCol w:w="2500"/>
       </w:tblGrid>
       <w:tr>
         <w:trPr>
@@ -3129,7 +3285,7 @@
         </w:trPr>
         <w:tc>
           <w:tcPr>
-            <w:tcW w:type="dxa" w:w="4200"/>
+            <w:tcW w:type="dxa" w:w="4600"/>
             <w:tcBorders>
               <w:top w:val="single" w:color="999999" w:sz="4"/>
               <w:left w:val="single" w:color="999999" w:sz="4"/>
@@ -3159,7 +3315,7 @@
         </w:tc>
         <w:tc>
           <w:tcPr>
-            <w:tcW w:type="dxa" w:w="2200"/>
+            <w:tcW w:type="dxa" w:w="1900"/>
             <w:tcBorders>
               <w:top w:val="single" w:color="999999" w:sz="4"/>
               <w:left w:val="single" w:color="999999" w:sz="4"/>
@@ -3189,7 +3345,7 @@
         </w:tc>
         <w:tc>
           <w:tcPr>
-            <w:tcW w:type="dxa" w:w="2600"/>
+            <w:tcW w:type="dxa" w:w="2500"/>
             <w:tcBorders>
               <w:top w:val="single" w:color="999999" w:sz="4"/>
               <w:left w:val="single" w:color="999999" w:sz="4"/>
@@ -3221,7 +3377,7 @@
       <w:tr>
         <w:tc>
           <w:tcPr>
-            <w:tcW w:type="dxa" w:w="4200"/>
+            <w:tcW w:type="dxa" w:w="4600"/>
             <w:tcBorders>
               <w:top w:val="single" w:color="999999" w:sz="4"/>
               <w:left w:val="single" w:color="999999" w:sz="4"/>
@@ -3250,30 +3406,29 @@
         </w:tc>
         <w:tc>
           <w:tcPr>
-            <w:tcW w:type="dxa" w:w="2200"/>
-            <w:tcBorders>
-              <w:top w:val="single" w:color="999999" w:sz="4"/>
-              <w:left w:val="single" w:color="999999" w:sz="4"/>
-              <w:bottom w:val="single" w:color="999999" w:sz="4"/>
-              <w:right w:val="single" w:color="999999" w:sz="4"/>
-            </w:tcBorders>
-            <w:tcMar>
-              <w:top w:type="dxa" w:w="60"/>
-              <w:left w:type="dxa" w:w="100"/>
-              <w:bottom w:type="dxa" w:w="60"/>
-              <w:right w:type="dxa" w:w="100"/>
-            </w:tcMar>
-          </w:tcPr>
-          <w:p>
-            <w:r>
-              <w:rPr>
-                <w:rFonts w:ascii="Times New Roman" w:cs="Times New Roman" w:eastAsia="Times New Roman" w:hAnsi="Times New Roman"/>
-                <w:b w:val="false"/>
-                <w:bCs w:val="false"/>
-                <w:sz w:val="22"/>
-                <w:szCs w:val="22"/>
-                <w:highlight w:val="yellow"/>
-                <w:highlightCs w:val="yellow"/>
+            <w:tcW w:type="dxa" w:w="1900"/>
+            <w:tcBorders>
+              <w:top w:val="single" w:color="999999" w:sz="4"/>
+              <w:left w:val="single" w:color="999999" w:sz="4"/>
+              <w:bottom w:val="single" w:color="999999" w:sz="4"/>
+              <w:right w:val="single" w:color="999999" w:sz="4"/>
+            </w:tcBorders>
+            <w:tcMar>
+              <w:top w:type="dxa" w:w="60"/>
+              <w:left w:type="dxa" w:w="100"/>
+              <w:bottom w:type="dxa" w:w="60"/>
+              <w:right w:type="dxa" w:w="100"/>
+            </w:tcMar>
+          </w:tcPr>
+          <w:p>
+            <w:r>
+              <w:rPr>
+                <w:rFonts w:ascii="Times New Roman" w:cs="Times New Roman" w:eastAsia="Times New Roman" w:hAnsi="Times New Roman"/>
+                <w:b w:val="false"/>
+                <w:bCs w:val="false"/>
+                <w:sz w:val="22"/>
+                <w:szCs w:val="22"/>
+                <w:shd w:fill="FFFF00" w:color="auto" w:val="clear"/>
               </w:rPr>
               <w:t xml:space="preserve">[plotëso]</w:t>
             </w:r>
@@ -3281,32 +3436,31 @@
         </w:tc>
         <w:tc>
           <w:tcPr>
-            <w:tcW w:type="dxa" w:w="2600"/>
-            <w:tcBorders>
-              <w:top w:val="single" w:color="999999" w:sz="4"/>
-              <w:left w:val="single" w:color="999999" w:sz="4"/>
-              <w:bottom w:val="single" w:color="999999" w:sz="4"/>
-              <w:right w:val="single" w:color="999999" w:sz="4"/>
-            </w:tcBorders>
-            <w:tcMar>
-              <w:top w:type="dxa" w:w="60"/>
-              <w:left w:type="dxa" w:w="100"/>
-              <w:bottom w:type="dxa" w:w="60"/>
-              <w:right w:type="dxa" w:w="100"/>
-            </w:tcMar>
-          </w:tcPr>
-          <w:p>
-            <w:r>
-              <w:rPr>
-                <w:rFonts w:ascii="Times New Roman" w:cs="Times New Roman" w:eastAsia="Times New Roman" w:hAnsi="Times New Roman"/>
-                <w:b w:val="false"/>
-                <w:bCs w:val="false"/>
-                <w:sz w:val="22"/>
-                <w:szCs w:val="22"/>
-                <w:highlight w:val="yellow"/>
-                <w:highlightCs w:val="yellow"/>
-              </w:rPr>
-              <w:t xml:space="preserve">[nga 20 pyetje]</w:t>
+            <w:tcW w:type="dxa" w:w="2500"/>
+            <w:tcBorders>
+              <w:top w:val="single" w:color="999999" w:sz="4"/>
+              <w:left w:val="single" w:color="999999" w:sz="4"/>
+              <w:bottom w:val="single" w:color="999999" w:sz="4"/>
+              <w:right w:val="single" w:color="999999" w:sz="4"/>
+            </w:tcBorders>
+            <w:tcMar>
+              <w:top w:type="dxa" w:w="60"/>
+              <w:left w:type="dxa" w:w="100"/>
+              <w:bottom w:type="dxa" w:w="60"/>
+              <w:right w:type="dxa" w:w="100"/>
+            </w:tcMar>
+          </w:tcPr>
+          <w:p>
+            <w:r>
+              <w:rPr>
+                <w:rFonts w:ascii="Times New Roman" w:cs="Times New Roman" w:eastAsia="Times New Roman" w:hAnsi="Times New Roman"/>
+                <w:b w:val="false"/>
+                <w:bCs w:val="false"/>
+                <w:sz w:val="22"/>
+                <w:szCs w:val="22"/>
+                <w:shd w:fill="FFFF00" w:color="auto" w:val="clear"/>
+              </w:rPr>
+              <w:t xml:space="preserve">[nga 42 pyetje]</w:t>
             </w:r>
           </w:p>
         </w:tc>
@@ -3314,7 +3468,7 @@
       <w:tr>
         <w:tc>
           <w:tcPr>
-            <w:tcW w:type="dxa" w:w="4200"/>
+            <w:tcW w:type="dxa" w:w="4600"/>
             <w:tcBorders>
               <w:top w:val="single" w:color="999999" w:sz="4"/>
               <w:left w:val="single" w:color="999999" w:sz="4"/>
@@ -3343,30 +3497,29 @@
         </w:tc>
         <w:tc>
           <w:tcPr>
-            <w:tcW w:type="dxa" w:w="2200"/>
-            <w:tcBorders>
-              <w:top w:val="single" w:color="999999" w:sz="4"/>
-              <w:left w:val="single" w:color="999999" w:sz="4"/>
-              <w:bottom w:val="single" w:color="999999" w:sz="4"/>
-              <w:right w:val="single" w:color="999999" w:sz="4"/>
-            </w:tcBorders>
-            <w:tcMar>
-              <w:top w:type="dxa" w:w="60"/>
-              <w:left w:type="dxa" w:w="100"/>
-              <w:bottom w:type="dxa" w:w="60"/>
-              <w:right w:type="dxa" w:w="100"/>
-            </w:tcMar>
-          </w:tcPr>
-          <w:p>
-            <w:r>
-              <w:rPr>
-                <w:rFonts w:ascii="Times New Roman" w:cs="Times New Roman" w:eastAsia="Times New Roman" w:hAnsi="Times New Roman"/>
-                <w:b w:val="false"/>
-                <w:bCs w:val="false"/>
-                <w:sz w:val="22"/>
-                <w:szCs w:val="22"/>
-                <w:highlight w:val="yellow"/>
-                <w:highlightCs w:val="yellow"/>
+            <w:tcW w:type="dxa" w:w="1900"/>
+            <w:tcBorders>
+              <w:top w:val="single" w:color="999999" w:sz="4"/>
+              <w:left w:val="single" w:color="999999" w:sz="4"/>
+              <w:bottom w:val="single" w:color="999999" w:sz="4"/>
+              <w:right w:val="single" w:color="999999" w:sz="4"/>
+            </w:tcBorders>
+            <w:tcMar>
+              <w:top w:type="dxa" w:w="60"/>
+              <w:left w:type="dxa" w:w="100"/>
+              <w:bottom w:type="dxa" w:w="60"/>
+              <w:right w:type="dxa" w:w="100"/>
+            </w:tcMar>
+          </w:tcPr>
+          <w:p>
+            <w:r>
+              <w:rPr>
+                <w:rFonts w:ascii="Times New Roman" w:cs="Times New Roman" w:eastAsia="Times New Roman" w:hAnsi="Times New Roman"/>
+                <w:b w:val="false"/>
+                <w:bCs w:val="false"/>
+                <w:sz w:val="22"/>
+                <w:szCs w:val="22"/>
+                <w:shd w:fill="FFFF00" w:color="auto" w:val="clear"/>
               </w:rPr>
               <w:t xml:space="preserve">[plotëso]</w:t>
             </w:r>
@@ -3374,7 +3527,7 @@
         </w:tc>
         <w:tc>
           <w:tcPr>
-            <w:tcW w:type="dxa" w:w="2600"/>
+            <w:tcW w:type="dxa" w:w="2500"/>
             <w:tcBorders>
               <w:top w:val="single" w:color="999999" w:sz="4"/>
               <w:left w:val="single" w:color="999999" w:sz="4"/>
@@ -3394,7 +3547,7 @@
       <w:tr>
         <w:tc>
           <w:tcPr>
-            <w:tcW w:type="dxa" w:w="4200"/>
+            <w:tcW w:type="dxa" w:w="4600"/>
             <w:tcBorders>
               <w:top w:val="single" w:color="999999" w:sz="4"/>
               <w:left w:val="single" w:color="999999" w:sz="4"/>
@@ -3423,30 +3576,29 @@
         </w:tc>
         <w:tc>
           <w:tcPr>
-            <w:tcW w:type="dxa" w:w="2200"/>
-            <w:tcBorders>
-              <w:top w:val="single" w:color="999999" w:sz="4"/>
-              <w:left w:val="single" w:color="999999" w:sz="4"/>
-              <w:bottom w:val="single" w:color="999999" w:sz="4"/>
-              <w:right w:val="single" w:color="999999" w:sz="4"/>
-            </w:tcBorders>
-            <w:tcMar>
-              <w:top w:type="dxa" w:w="60"/>
-              <w:left w:type="dxa" w:w="100"/>
-              <w:bottom w:type="dxa" w:w="60"/>
-              <w:right w:type="dxa" w:w="100"/>
-            </w:tcMar>
-          </w:tcPr>
-          <w:p>
-            <w:r>
-              <w:rPr>
-                <w:rFonts w:ascii="Times New Roman" w:cs="Times New Roman" w:eastAsia="Times New Roman" w:hAnsi="Times New Roman"/>
-                <w:b w:val="false"/>
-                <w:bCs w:val="false"/>
-                <w:sz w:val="22"/>
-                <w:szCs w:val="22"/>
-                <w:highlight w:val="yellow"/>
-                <w:highlightCs w:val="yellow"/>
+            <w:tcW w:type="dxa" w:w="1900"/>
+            <w:tcBorders>
+              <w:top w:val="single" w:color="999999" w:sz="4"/>
+              <w:left w:val="single" w:color="999999" w:sz="4"/>
+              <w:bottom w:val="single" w:color="999999" w:sz="4"/>
+              <w:right w:val="single" w:color="999999" w:sz="4"/>
+            </w:tcBorders>
+            <w:tcMar>
+              <w:top w:type="dxa" w:w="60"/>
+              <w:left w:type="dxa" w:w="100"/>
+              <w:bottom w:type="dxa" w:w="60"/>
+              <w:right w:type="dxa" w:w="100"/>
+            </w:tcMar>
+          </w:tcPr>
+          <w:p>
+            <w:r>
+              <w:rPr>
+                <w:rFonts w:ascii="Times New Roman" w:cs="Times New Roman" w:eastAsia="Times New Roman" w:hAnsi="Times New Roman"/>
+                <w:b w:val="false"/>
+                <w:bCs w:val="false"/>
+                <w:sz w:val="22"/>
+                <w:szCs w:val="22"/>
+                <w:shd w:fill="FFFF00" w:color="auto" w:val="clear"/>
               </w:rPr>
               <w:t xml:space="preserve">[plotëso]</w:t>
             </w:r>
@@ -3454,7 +3606,7 @@
         </w:tc>
         <w:tc>
           <w:tcPr>
-            <w:tcW w:type="dxa" w:w="2600"/>
+            <w:tcW w:type="dxa" w:w="2500"/>
             <w:tcBorders>
               <w:top w:val="single" w:color="999999" w:sz="4"/>
               <w:left w:val="single" w:color="999999" w:sz="4"/>
@@ -3474,7 +3626,7 @@
       <w:tr>
         <w:tc>
           <w:tcPr>
-            <w:tcW w:type="dxa" w:w="4200"/>
+            <w:tcW w:type="dxa" w:w="4600"/>
             <w:tcBorders>
               <w:top w:val="single" w:color="999999" w:sz="4"/>
               <w:left w:val="single" w:color="999999" w:sz="4"/>
@@ -3503,30 +3655,29 @@
         </w:tc>
         <w:tc>
           <w:tcPr>
-            <w:tcW w:type="dxa" w:w="2200"/>
-            <w:tcBorders>
-              <w:top w:val="single" w:color="999999" w:sz="4"/>
-              <w:left w:val="single" w:color="999999" w:sz="4"/>
-              <w:bottom w:val="single" w:color="999999" w:sz="4"/>
-              <w:right w:val="single" w:color="999999" w:sz="4"/>
-            </w:tcBorders>
-            <w:tcMar>
-              <w:top w:type="dxa" w:w="60"/>
-              <w:left w:type="dxa" w:w="100"/>
-              <w:bottom w:type="dxa" w:w="60"/>
-              <w:right w:type="dxa" w:w="100"/>
-            </w:tcMar>
-          </w:tcPr>
-          <w:p>
-            <w:r>
-              <w:rPr>
-                <w:rFonts w:ascii="Times New Roman" w:cs="Times New Roman" w:eastAsia="Times New Roman" w:hAnsi="Times New Roman"/>
-                <w:b w:val="false"/>
-                <w:bCs w:val="false"/>
-                <w:sz w:val="22"/>
-                <w:szCs w:val="22"/>
-                <w:highlight w:val="yellow"/>
-                <w:highlightCs w:val="yellow"/>
+            <w:tcW w:type="dxa" w:w="1900"/>
+            <w:tcBorders>
+              <w:top w:val="single" w:color="999999" w:sz="4"/>
+              <w:left w:val="single" w:color="999999" w:sz="4"/>
+              <w:bottom w:val="single" w:color="999999" w:sz="4"/>
+              <w:right w:val="single" w:color="999999" w:sz="4"/>
+            </w:tcBorders>
+            <w:tcMar>
+              <w:top w:type="dxa" w:w="60"/>
+              <w:left w:type="dxa" w:w="100"/>
+              <w:bottom w:type="dxa" w:w="60"/>
+              <w:right w:type="dxa" w:w="100"/>
+            </w:tcMar>
+          </w:tcPr>
+          <w:p>
+            <w:r>
+              <w:rPr>
+                <w:rFonts w:ascii="Times New Roman" w:cs="Times New Roman" w:eastAsia="Times New Roman" w:hAnsi="Times New Roman"/>
+                <w:b w:val="false"/>
+                <w:bCs w:val="false"/>
+                <w:sz w:val="22"/>
+                <w:szCs w:val="22"/>
+                <w:shd w:fill="FFFF00" w:color="auto" w:val="clear"/>
               </w:rPr>
               <w:t xml:space="preserve">[plotëso]</w:t>
             </w:r>
@@ -3534,32 +3685,31 @@
         </w:tc>
         <w:tc>
           <w:tcPr>
-            <w:tcW w:type="dxa" w:w="2600"/>
-            <w:tcBorders>
-              <w:top w:val="single" w:color="999999" w:sz="4"/>
-              <w:left w:val="single" w:color="999999" w:sz="4"/>
-              <w:bottom w:val="single" w:color="999999" w:sz="4"/>
-              <w:right w:val="single" w:color="999999" w:sz="4"/>
-            </w:tcBorders>
-            <w:tcMar>
-              <w:top w:type="dxa" w:w="60"/>
-              <w:left w:type="dxa" w:w="100"/>
-              <w:bottom w:type="dxa" w:w="60"/>
-              <w:right w:type="dxa" w:w="100"/>
-            </w:tcMar>
-          </w:tcPr>
-          <w:p>
-            <w:r>
-              <w:rPr>
-                <w:rFonts w:ascii="Times New Roman" w:cs="Times New Roman" w:eastAsia="Times New Roman" w:hAnsi="Times New Roman"/>
-                <w:b w:val="false"/>
-                <w:bCs w:val="false"/>
-                <w:sz w:val="22"/>
-                <w:szCs w:val="22"/>
-                <w:highlight w:val="yellow"/>
-                <w:highlightCs w:val="yellow"/>
-              </w:rPr>
-              <w:t xml:space="preserve">[nga 20 pyetje]</w:t>
+            <w:tcW w:type="dxa" w:w="2500"/>
+            <w:tcBorders>
+              <w:top w:val="single" w:color="999999" w:sz="4"/>
+              <w:left w:val="single" w:color="999999" w:sz="4"/>
+              <w:bottom w:val="single" w:color="999999" w:sz="4"/>
+              <w:right w:val="single" w:color="999999" w:sz="4"/>
+            </w:tcBorders>
+            <w:tcMar>
+              <w:top w:type="dxa" w:w="60"/>
+              <w:left w:type="dxa" w:w="100"/>
+              <w:bottom w:type="dxa" w:w="60"/>
+              <w:right w:type="dxa" w:w="100"/>
+            </w:tcMar>
+          </w:tcPr>
+          <w:p>
+            <w:r>
+              <w:rPr>
+                <w:rFonts w:ascii="Times New Roman" w:cs="Times New Roman" w:eastAsia="Times New Roman" w:hAnsi="Times New Roman"/>
+                <w:b w:val="false"/>
+                <w:bCs w:val="false"/>
+                <w:sz w:val="22"/>
+                <w:szCs w:val="22"/>
+                <w:shd w:fill="FFFF00" w:color="auto" w:val="clear"/>
+              </w:rPr>
+              <w:t xml:space="preserve">[nga 42 pyetje]</w:t>
             </w:r>
           </w:p>
         </w:tc>
@@ -3567,59 +3717,58 @@
       <w:tr>
         <w:tc>
           <w:tcPr>
-            <w:tcW w:type="dxa" w:w="4200"/>
-            <w:tcBorders>
-              <w:top w:val="single" w:color="999999" w:sz="4"/>
-              <w:left w:val="single" w:color="999999" w:sz="4"/>
-              <w:bottom w:val="single" w:color="999999" w:sz="4"/>
-              <w:right w:val="single" w:color="999999" w:sz="4"/>
-            </w:tcBorders>
-            <w:tcMar>
-              <w:top w:type="dxa" w:w="60"/>
-              <w:left w:type="dxa" w:w="100"/>
-              <w:bottom w:type="dxa" w:w="60"/>
-              <w:right w:type="dxa" w:w="100"/>
-            </w:tcMar>
-          </w:tcPr>
-          <w:p>
-            <w:r>
-              <w:rPr>
-                <w:rFonts w:ascii="Times New Roman" w:cs="Times New Roman" w:eastAsia="Times New Roman" w:hAnsi="Times New Roman"/>
-                <w:b w:val="false"/>
-                <w:bCs w:val="false"/>
-                <w:sz w:val="22"/>
-                <w:szCs w:val="22"/>
-              </w:rPr>
-              <w:t xml:space="preserve">Refuzime të sakta (jashtë korpusit)</w:t>
-            </w:r>
-          </w:p>
-        </w:tc>
-        <w:tc>
-          <w:tcPr>
-            <w:tcW w:type="dxa" w:w="2200"/>
-            <w:tcBorders>
-              <w:top w:val="single" w:color="999999" w:sz="4"/>
-              <w:left w:val="single" w:color="999999" w:sz="4"/>
-              <w:bottom w:val="single" w:color="999999" w:sz="4"/>
-              <w:right w:val="single" w:color="999999" w:sz="4"/>
-            </w:tcBorders>
-            <w:tcMar>
-              <w:top w:type="dxa" w:w="60"/>
-              <w:left w:type="dxa" w:w="100"/>
-              <w:bottom w:type="dxa" w:w="60"/>
-              <w:right w:type="dxa" w:w="100"/>
-            </w:tcMar>
-          </w:tcPr>
-          <w:p>
-            <w:r>
-              <w:rPr>
-                <w:rFonts w:ascii="Times New Roman" w:cs="Times New Roman" w:eastAsia="Times New Roman" w:hAnsi="Times New Roman"/>
-                <w:b w:val="false"/>
-                <w:bCs w:val="false"/>
-                <w:sz w:val="22"/>
-                <w:szCs w:val="22"/>
-                <w:highlight w:val="yellow"/>
-                <w:highlightCs w:val="yellow"/>
+            <w:tcW w:type="dxa" w:w="4600"/>
+            <w:tcBorders>
+              <w:top w:val="single" w:color="999999" w:sz="4"/>
+              <w:left w:val="single" w:color="999999" w:sz="4"/>
+              <w:bottom w:val="single" w:color="999999" w:sz="4"/>
+              <w:right w:val="single" w:color="999999" w:sz="4"/>
+            </w:tcBorders>
+            <w:tcMar>
+              <w:top w:type="dxa" w:w="60"/>
+              <w:left w:type="dxa" w:w="100"/>
+              <w:bottom w:type="dxa" w:w="60"/>
+              <w:right w:type="dxa" w:w="100"/>
+            </w:tcMar>
+          </w:tcPr>
+          <w:p>
+            <w:r>
+              <w:rPr>
+                <w:rFonts w:ascii="Times New Roman" w:cs="Times New Roman" w:eastAsia="Times New Roman" w:hAnsi="Times New Roman"/>
+                <w:b w:val="false"/>
+                <w:bCs w:val="false"/>
+                <w:sz w:val="22"/>
+                <w:szCs w:val="22"/>
+              </w:rPr>
+              <w:t xml:space="preserve">Përgjigje me halucinacion</w:t>
+            </w:r>
+          </w:p>
+        </w:tc>
+        <w:tc>
+          <w:tcPr>
+            <w:tcW w:type="dxa" w:w="1900"/>
+            <w:tcBorders>
+              <w:top w:val="single" w:color="999999" w:sz="4"/>
+              <w:left w:val="single" w:color="999999" w:sz="4"/>
+              <w:bottom w:val="single" w:color="999999" w:sz="4"/>
+              <w:right w:val="single" w:color="999999" w:sz="4"/>
+            </w:tcBorders>
+            <w:tcMar>
+              <w:top w:type="dxa" w:w="60"/>
+              <w:left w:type="dxa" w:w="100"/>
+              <w:bottom w:type="dxa" w:w="60"/>
+              <w:right w:type="dxa" w:w="100"/>
+            </w:tcMar>
+          </w:tcPr>
+          <w:p>
+            <w:r>
+              <w:rPr>
+                <w:rFonts w:ascii="Times New Roman" w:cs="Times New Roman" w:eastAsia="Times New Roman" w:hAnsi="Times New Roman"/>
+                <w:b w:val="false"/>
+                <w:bCs w:val="false"/>
+                <w:sz w:val="22"/>
+                <w:szCs w:val="22"/>
+                <w:shd w:fill="FFFF00" w:color="auto" w:val="clear"/>
               </w:rPr>
               <w:t xml:space="preserve">[plotëso]</w:t>
             </w:r>
@@ -3627,32 +3776,31 @@
         </w:tc>
         <w:tc>
           <w:tcPr>
-            <w:tcW w:type="dxa" w:w="2600"/>
-            <w:tcBorders>
-              <w:top w:val="single" w:color="999999" w:sz="4"/>
-              <w:left w:val="single" w:color="999999" w:sz="4"/>
-              <w:bottom w:val="single" w:color="999999" w:sz="4"/>
-              <w:right w:val="single" w:color="999999" w:sz="4"/>
-            </w:tcBorders>
-            <w:tcMar>
-              <w:top w:type="dxa" w:w="60"/>
-              <w:left w:type="dxa" w:w="100"/>
-              <w:bottom w:type="dxa" w:w="60"/>
-              <w:right w:type="dxa" w:w="100"/>
-            </w:tcMar>
-          </w:tcPr>
-          <w:p>
-            <w:r>
-              <w:rPr>
-                <w:rFonts w:ascii="Times New Roman" w:cs="Times New Roman" w:eastAsia="Times New Roman" w:hAnsi="Times New Roman"/>
-                <w:b w:val="false"/>
-                <w:bCs w:val="false"/>
-                <w:sz w:val="22"/>
-                <w:szCs w:val="22"/>
-                <w:highlight w:val="yellow"/>
-                <w:highlightCs w:val="yellow"/>
-              </w:rPr>
-              <w:t xml:space="preserve">[nga 5 pyetje]</w:t>
+            <w:tcW w:type="dxa" w:w="2500"/>
+            <w:tcBorders>
+              <w:top w:val="single" w:color="999999" w:sz="4"/>
+              <w:left w:val="single" w:color="999999" w:sz="4"/>
+              <w:bottom w:val="single" w:color="999999" w:sz="4"/>
+              <w:right w:val="single" w:color="999999" w:sz="4"/>
+            </w:tcBorders>
+            <w:tcMar>
+              <w:top w:type="dxa" w:w="60"/>
+              <w:left w:type="dxa" w:w="100"/>
+              <w:bottom w:type="dxa" w:w="60"/>
+              <w:right w:type="dxa" w:w="100"/>
+            </w:tcMar>
+          </w:tcPr>
+          <w:p>
+            <w:r>
+              <w:rPr>
+                <w:rFonts w:ascii="Times New Roman" w:cs="Times New Roman" w:eastAsia="Times New Roman" w:hAnsi="Times New Roman"/>
+                <w:b w:val="false"/>
+                <w:bCs w:val="false"/>
+                <w:sz w:val="22"/>
+                <w:szCs w:val="22"/>
+                <w:shd w:fill="FFFF00" w:color="auto" w:val="clear"/>
+              </w:rPr>
+              <w:t xml:space="preserve">[nga 56 pyetje]</w:t>
             </w:r>
           </w:p>
         </w:tc>
@@ -3660,59 +3808,58 @@
       <w:tr>
         <w:tc>
           <w:tcPr>
-            <w:tcW w:type="dxa" w:w="4200"/>
-            <w:tcBorders>
-              <w:top w:val="single" w:color="999999" w:sz="4"/>
-              <w:left w:val="single" w:color="999999" w:sz="4"/>
-              <w:bottom w:val="single" w:color="999999" w:sz="4"/>
-              <w:right w:val="single" w:color="999999" w:sz="4"/>
-            </w:tcBorders>
-            <w:tcMar>
-              <w:top w:type="dxa" w:w="60"/>
-              <w:left w:type="dxa" w:w="100"/>
-              <w:bottom w:type="dxa" w:w="60"/>
-              <w:right w:type="dxa" w:w="100"/>
-            </w:tcMar>
-          </w:tcPr>
-          <w:p>
-            <w:r>
-              <w:rPr>
-                <w:rFonts w:ascii="Times New Roman" w:cs="Times New Roman" w:eastAsia="Times New Roman" w:hAnsi="Times New Roman"/>
-                <w:b w:val="false"/>
-                <w:bCs w:val="false"/>
-                <w:sz w:val="22"/>
-                <w:szCs w:val="22"/>
-              </w:rPr>
-              <w:t xml:space="preserve">Refuzime të gabuara (brenda korpusit)</w:t>
-            </w:r>
-          </w:p>
-        </w:tc>
-        <w:tc>
-          <w:tcPr>
-            <w:tcW w:type="dxa" w:w="2200"/>
-            <w:tcBorders>
-              <w:top w:val="single" w:color="999999" w:sz="4"/>
-              <w:left w:val="single" w:color="999999" w:sz="4"/>
-              <w:bottom w:val="single" w:color="999999" w:sz="4"/>
-              <w:right w:val="single" w:color="999999" w:sz="4"/>
-            </w:tcBorders>
-            <w:tcMar>
-              <w:top w:type="dxa" w:w="60"/>
-              <w:left w:type="dxa" w:w="100"/>
-              <w:bottom w:type="dxa" w:w="60"/>
-              <w:right w:type="dxa" w:w="100"/>
-            </w:tcMar>
-          </w:tcPr>
-          <w:p>
-            <w:r>
-              <w:rPr>
-                <w:rFonts w:ascii="Times New Roman" w:cs="Times New Roman" w:eastAsia="Times New Roman" w:hAnsi="Times New Roman"/>
-                <w:b w:val="false"/>
-                <w:bCs w:val="false"/>
-                <w:sz w:val="22"/>
-                <w:szCs w:val="22"/>
-                <w:highlight w:val="yellow"/>
-                <w:highlightCs w:val="yellow"/>
+            <w:tcW w:type="dxa" w:w="4600"/>
+            <w:tcBorders>
+              <w:top w:val="single" w:color="999999" w:sz="4"/>
+              <w:left w:val="single" w:color="999999" w:sz="4"/>
+              <w:bottom w:val="single" w:color="999999" w:sz="4"/>
+              <w:right w:val="single" w:color="999999" w:sz="4"/>
+            </w:tcBorders>
+            <w:tcMar>
+              <w:top w:type="dxa" w:w="60"/>
+              <w:left w:type="dxa" w:w="100"/>
+              <w:bottom w:type="dxa" w:w="60"/>
+              <w:right w:type="dxa" w:w="100"/>
+            </w:tcMar>
+          </w:tcPr>
+          <w:p>
+            <w:r>
+              <w:rPr>
+                <w:rFonts w:ascii="Times New Roman" w:cs="Times New Roman" w:eastAsia="Times New Roman" w:hAnsi="Times New Roman"/>
+                <w:b w:val="false"/>
+                <w:bCs w:val="false"/>
+                <w:sz w:val="22"/>
+                <w:szCs w:val="22"/>
+              </w:rPr>
+              <w:t xml:space="preserve">Personalizim i saktë (pyetjet me profil)</w:t>
+            </w:r>
+          </w:p>
+        </w:tc>
+        <w:tc>
+          <w:tcPr>
+            <w:tcW w:type="dxa" w:w="1900"/>
+            <w:tcBorders>
+              <w:top w:val="single" w:color="999999" w:sz="4"/>
+              <w:left w:val="single" w:color="999999" w:sz="4"/>
+              <w:bottom w:val="single" w:color="999999" w:sz="4"/>
+              <w:right w:val="single" w:color="999999" w:sz="4"/>
+            </w:tcBorders>
+            <w:tcMar>
+              <w:top w:type="dxa" w:w="60"/>
+              <w:left w:type="dxa" w:w="100"/>
+              <w:bottom w:type="dxa" w:w="60"/>
+              <w:right w:type="dxa" w:w="100"/>
+            </w:tcMar>
+          </w:tcPr>
+          <w:p>
+            <w:r>
+              <w:rPr>
+                <w:rFonts w:ascii="Times New Roman" w:cs="Times New Roman" w:eastAsia="Times New Roman" w:hAnsi="Times New Roman"/>
+                <w:b w:val="false"/>
+                <w:bCs w:val="false"/>
+                <w:sz w:val="22"/>
+                <w:szCs w:val="22"/>
+                <w:shd w:fill="FFFF00" w:color="auto" w:val="clear"/>
               </w:rPr>
               <w:t xml:space="preserve">[plotëso]</w:t>
             </w:r>
@@ -3720,32 +3867,31 @@
         </w:tc>
         <w:tc>
           <w:tcPr>
-            <w:tcW w:type="dxa" w:w="2600"/>
-            <w:tcBorders>
-              <w:top w:val="single" w:color="999999" w:sz="4"/>
-              <w:left w:val="single" w:color="999999" w:sz="4"/>
-              <w:bottom w:val="single" w:color="999999" w:sz="4"/>
-              <w:right w:val="single" w:color="999999" w:sz="4"/>
-            </w:tcBorders>
-            <w:tcMar>
-              <w:top w:type="dxa" w:w="60"/>
-              <w:left w:type="dxa" w:w="100"/>
-              <w:bottom w:type="dxa" w:w="60"/>
-              <w:right w:type="dxa" w:w="100"/>
-            </w:tcMar>
-          </w:tcPr>
-          <w:p>
-            <w:r>
-              <w:rPr>
-                <w:rFonts w:ascii="Times New Roman" w:cs="Times New Roman" w:eastAsia="Times New Roman" w:hAnsi="Times New Roman"/>
-                <w:b w:val="false"/>
-                <w:bCs w:val="false"/>
-                <w:sz w:val="22"/>
-                <w:szCs w:val="22"/>
-                <w:highlight w:val="yellow"/>
-                <w:highlightCs w:val="yellow"/>
-              </w:rPr>
-              <w:t xml:space="preserve">[nga 20 pyetje]</w:t>
+            <w:tcW w:type="dxa" w:w="2500"/>
+            <w:tcBorders>
+              <w:top w:val="single" w:color="999999" w:sz="4"/>
+              <w:left w:val="single" w:color="999999" w:sz="4"/>
+              <w:bottom w:val="single" w:color="999999" w:sz="4"/>
+              <w:right w:val="single" w:color="999999" w:sz="4"/>
+            </w:tcBorders>
+            <w:tcMar>
+              <w:top w:type="dxa" w:w="60"/>
+              <w:left w:type="dxa" w:w="100"/>
+              <w:bottom w:type="dxa" w:w="60"/>
+              <w:right w:type="dxa" w:w="100"/>
+            </w:tcMar>
+          </w:tcPr>
+          <w:p>
+            <w:r>
+              <w:rPr>
+                <w:rFonts w:ascii="Times New Roman" w:cs="Times New Roman" w:eastAsia="Times New Roman" w:hAnsi="Times New Roman"/>
+                <w:b w:val="false"/>
+                <w:bCs w:val="false"/>
+                <w:sz w:val="22"/>
+                <w:szCs w:val="22"/>
+                <w:shd w:fill="FFFF00" w:color="auto" w:val="clear"/>
+              </w:rPr>
+              <w:t xml:space="preserve">[nga pyetjet me profil]</w:t>
             </w:r>
           </w:p>
         </w:tc>
@@ -3753,59 +3899,58 @@
       <w:tr>
         <w:tc>
           <w:tcPr>
-            <w:tcW w:type="dxa" w:w="4200"/>
-            <w:tcBorders>
-              <w:top w:val="single" w:color="999999" w:sz="4"/>
-              <w:left w:val="single" w:color="999999" w:sz="4"/>
-              <w:bottom w:val="single" w:color="999999" w:sz="4"/>
-              <w:right w:val="single" w:color="999999" w:sz="4"/>
-            </w:tcBorders>
-            <w:tcMar>
-              <w:top w:type="dxa" w:w="60"/>
-              <w:left w:type="dxa" w:w="100"/>
-              <w:bottom w:type="dxa" w:w="60"/>
-              <w:right w:type="dxa" w:w="100"/>
-            </w:tcMar>
-          </w:tcPr>
-          <w:p>
-            <w:r>
-              <w:rPr>
-                <w:rFonts w:ascii="Times New Roman" w:cs="Times New Roman" w:eastAsia="Times New Roman" w:hAnsi="Times New Roman"/>
-                <w:b w:val="false"/>
-                <w:bCs w:val="false"/>
-                <w:sz w:val="22"/>
-                <w:szCs w:val="22"/>
-              </w:rPr>
-              <w:t xml:space="preserve">Koha mesatare e përgjigjes</w:t>
-            </w:r>
-          </w:p>
-        </w:tc>
-        <w:tc>
-          <w:tcPr>
-            <w:tcW w:type="dxa" w:w="2200"/>
-            <w:tcBorders>
-              <w:top w:val="single" w:color="999999" w:sz="4"/>
-              <w:left w:val="single" w:color="999999" w:sz="4"/>
-              <w:bottom w:val="single" w:color="999999" w:sz="4"/>
-              <w:right w:val="single" w:color="999999" w:sz="4"/>
-            </w:tcBorders>
-            <w:tcMar>
-              <w:top w:type="dxa" w:w="60"/>
-              <w:left w:type="dxa" w:w="100"/>
-              <w:bottom w:type="dxa" w:w="60"/>
-              <w:right w:type="dxa" w:w="100"/>
-            </w:tcMar>
-          </w:tcPr>
-          <w:p>
-            <w:r>
-              <w:rPr>
-                <w:rFonts w:ascii="Times New Roman" w:cs="Times New Roman" w:eastAsia="Times New Roman" w:hAnsi="Times New Roman"/>
-                <w:b w:val="false"/>
-                <w:bCs w:val="false"/>
-                <w:sz w:val="22"/>
-                <w:szCs w:val="22"/>
-                <w:highlight w:val="yellow"/>
-                <w:highlightCs w:val="yellow"/>
+            <w:tcW w:type="dxa" w:w="4600"/>
+            <w:tcBorders>
+              <w:top w:val="single" w:color="999999" w:sz="4"/>
+              <w:left w:val="single" w:color="999999" w:sz="4"/>
+              <w:bottom w:val="single" w:color="999999" w:sz="4"/>
+              <w:right w:val="single" w:color="999999" w:sz="4"/>
+            </w:tcBorders>
+            <w:tcMar>
+              <w:top w:type="dxa" w:w="60"/>
+              <w:left w:type="dxa" w:w="100"/>
+              <w:bottom w:type="dxa" w:w="60"/>
+              <w:right w:type="dxa" w:w="100"/>
+            </w:tcMar>
+          </w:tcPr>
+          <w:p>
+            <w:r>
+              <w:rPr>
+                <w:rFonts w:ascii="Times New Roman" w:cs="Times New Roman" w:eastAsia="Times New Roman" w:hAnsi="Times New Roman"/>
+                <w:b w:val="false"/>
+                <w:bCs w:val="false"/>
+                <w:sz w:val="22"/>
+                <w:szCs w:val="22"/>
+              </w:rPr>
+              <w:t xml:space="preserve">Refuzime ose abstenime të sakta (jashtë korpusit)</w:t>
+            </w:r>
+          </w:p>
+        </w:tc>
+        <w:tc>
+          <w:tcPr>
+            <w:tcW w:type="dxa" w:w="1900"/>
+            <w:tcBorders>
+              <w:top w:val="single" w:color="999999" w:sz="4"/>
+              <w:left w:val="single" w:color="999999" w:sz="4"/>
+              <w:bottom w:val="single" w:color="999999" w:sz="4"/>
+              <w:right w:val="single" w:color="999999" w:sz="4"/>
+            </w:tcBorders>
+            <w:tcMar>
+              <w:top w:type="dxa" w:w="60"/>
+              <w:left w:type="dxa" w:w="100"/>
+              <w:bottom w:type="dxa" w:w="60"/>
+              <w:right w:type="dxa" w:w="100"/>
+            </w:tcMar>
+          </w:tcPr>
+          <w:p>
+            <w:r>
+              <w:rPr>
+                <w:rFonts w:ascii="Times New Roman" w:cs="Times New Roman" w:eastAsia="Times New Roman" w:hAnsi="Times New Roman"/>
+                <w:b w:val="false"/>
+                <w:bCs w:val="false"/>
+                <w:sz w:val="22"/>
+                <w:szCs w:val="22"/>
+                <w:shd w:fill="FFFF00" w:color="auto" w:val="clear"/>
               </w:rPr>
               <w:t xml:space="preserve">[plotëso]</w:t>
             </w:r>
@@ -3813,30 +3958,302 @@
         </w:tc>
         <w:tc>
           <w:tcPr>
-            <w:tcW w:type="dxa" w:w="2600"/>
-            <w:tcBorders>
-              <w:top w:val="single" w:color="999999" w:sz="4"/>
-              <w:left w:val="single" w:color="999999" w:sz="4"/>
-              <w:bottom w:val="single" w:color="999999" w:sz="4"/>
-              <w:right w:val="single" w:color="999999" w:sz="4"/>
-            </w:tcBorders>
-            <w:tcMar>
-              <w:top w:type="dxa" w:w="60"/>
-              <w:left w:type="dxa" w:w="100"/>
-              <w:bottom w:type="dxa" w:w="60"/>
-              <w:right w:type="dxa" w:w="100"/>
-            </w:tcMar>
-          </w:tcPr>
-          <w:p>
-            <w:r>
-              <w:rPr>
-                <w:rFonts w:ascii="Times New Roman" w:cs="Times New Roman" w:eastAsia="Times New Roman" w:hAnsi="Times New Roman"/>
-                <w:b w:val="false"/>
-                <w:bCs w:val="false"/>
-                <w:sz w:val="22"/>
-                <w:szCs w:val="22"/>
-                <w:highlight w:val="yellow"/>
-                <w:highlightCs w:val="yellow"/>
+            <w:tcW w:type="dxa" w:w="2500"/>
+            <w:tcBorders>
+              <w:top w:val="single" w:color="999999" w:sz="4"/>
+              <w:left w:val="single" w:color="999999" w:sz="4"/>
+              <w:bottom w:val="single" w:color="999999" w:sz="4"/>
+              <w:right w:val="single" w:color="999999" w:sz="4"/>
+            </w:tcBorders>
+            <w:tcMar>
+              <w:top w:type="dxa" w:w="60"/>
+              <w:left w:type="dxa" w:w="100"/>
+              <w:bottom w:type="dxa" w:w="60"/>
+              <w:right w:type="dxa" w:w="100"/>
+            </w:tcMar>
+          </w:tcPr>
+          <w:p>
+            <w:r>
+              <w:rPr>
+                <w:rFonts w:ascii="Times New Roman" w:cs="Times New Roman" w:eastAsia="Times New Roman" w:hAnsi="Times New Roman"/>
+                <w:b w:val="false"/>
+                <w:bCs w:val="false"/>
+                <w:sz w:val="22"/>
+                <w:szCs w:val="22"/>
+                <w:shd w:fill="FFFF00" w:color="auto" w:val="clear"/>
+              </w:rPr>
+              <w:t xml:space="preserve">[nga 14 pyetje]</w:t>
+            </w:r>
+          </w:p>
+        </w:tc>
+      </w:tr>
+      <w:tr>
+        <w:tc>
+          <w:tcPr>
+            <w:tcW w:type="dxa" w:w="4600"/>
+            <w:tcBorders>
+              <w:top w:val="single" w:color="999999" w:sz="4"/>
+              <w:left w:val="single" w:color="999999" w:sz="4"/>
+              <w:bottom w:val="single" w:color="999999" w:sz="4"/>
+              <w:right w:val="single" w:color="999999" w:sz="4"/>
+            </w:tcBorders>
+            <w:tcMar>
+              <w:top w:type="dxa" w:w="60"/>
+              <w:left w:type="dxa" w:w="100"/>
+              <w:bottom w:type="dxa" w:w="60"/>
+              <w:right w:type="dxa" w:w="100"/>
+            </w:tcMar>
+          </w:tcPr>
+          <w:p>
+            <w:r>
+              <w:rPr>
+                <w:rFonts w:ascii="Times New Roman" w:cs="Times New Roman" w:eastAsia="Times New Roman" w:hAnsi="Times New Roman"/>
+                <w:b w:val="false"/>
+                <w:bCs w:val="false"/>
+                <w:sz w:val="22"/>
+                <w:szCs w:val="22"/>
+              </w:rPr>
+              <w:t xml:space="preserve">Refuzime të gabuara (brenda korpusit)</w:t>
+            </w:r>
+          </w:p>
+        </w:tc>
+        <w:tc>
+          <w:tcPr>
+            <w:tcW w:type="dxa" w:w="1900"/>
+            <w:tcBorders>
+              <w:top w:val="single" w:color="999999" w:sz="4"/>
+              <w:left w:val="single" w:color="999999" w:sz="4"/>
+              <w:bottom w:val="single" w:color="999999" w:sz="4"/>
+              <w:right w:val="single" w:color="999999" w:sz="4"/>
+            </w:tcBorders>
+            <w:tcMar>
+              <w:top w:type="dxa" w:w="60"/>
+              <w:left w:type="dxa" w:w="100"/>
+              <w:bottom w:type="dxa" w:w="60"/>
+              <w:right w:type="dxa" w:w="100"/>
+            </w:tcMar>
+          </w:tcPr>
+          <w:p>
+            <w:r>
+              <w:rPr>
+                <w:rFonts w:ascii="Times New Roman" w:cs="Times New Roman" w:eastAsia="Times New Roman" w:hAnsi="Times New Roman"/>
+                <w:b w:val="false"/>
+                <w:bCs w:val="false"/>
+                <w:sz w:val="22"/>
+                <w:szCs w:val="22"/>
+                <w:shd w:fill="FFFF00" w:color="auto" w:val="clear"/>
+              </w:rPr>
+              <w:t xml:space="preserve">[plotëso]</w:t>
+            </w:r>
+          </w:p>
+        </w:tc>
+        <w:tc>
+          <w:tcPr>
+            <w:tcW w:type="dxa" w:w="2500"/>
+            <w:tcBorders>
+              <w:top w:val="single" w:color="999999" w:sz="4"/>
+              <w:left w:val="single" w:color="999999" w:sz="4"/>
+              <w:bottom w:val="single" w:color="999999" w:sz="4"/>
+              <w:right w:val="single" w:color="999999" w:sz="4"/>
+            </w:tcBorders>
+            <w:tcMar>
+              <w:top w:type="dxa" w:w="60"/>
+              <w:left w:type="dxa" w:w="100"/>
+              <w:bottom w:type="dxa" w:w="60"/>
+              <w:right w:type="dxa" w:w="100"/>
+            </w:tcMar>
+          </w:tcPr>
+          <w:p>
+            <w:r>
+              <w:rPr>
+                <w:rFonts w:ascii="Times New Roman" w:cs="Times New Roman" w:eastAsia="Times New Roman" w:hAnsi="Times New Roman"/>
+                <w:b w:val="false"/>
+                <w:bCs w:val="false"/>
+                <w:sz w:val="22"/>
+                <w:szCs w:val="22"/>
+                <w:shd w:fill="FFFF00" w:color="auto" w:val="clear"/>
+              </w:rPr>
+              <w:t xml:space="preserve">[nga 42 pyetje]</w:t>
+            </w:r>
+          </w:p>
+        </w:tc>
+      </w:tr>
+      <w:tr>
+        <w:tc>
+          <w:tcPr>
+            <w:tcW w:type="dxa" w:w="4600"/>
+            <w:tcBorders>
+              <w:top w:val="single" w:color="999999" w:sz="4"/>
+              <w:left w:val="single" w:color="999999" w:sz="4"/>
+              <w:bottom w:val="single" w:color="999999" w:sz="4"/>
+              <w:right w:val="single" w:color="999999" w:sz="4"/>
+            </w:tcBorders>
+            <w:tcMar>
+              <w:top w:type="dxa" w:w="60"/>
+              <w:left w:type="dxa" w:w="100"/>
+              <w:bottom w:type="dxa" w:w="60"/>
+              <w:right w:type="dxa" w:w="100"/>
+            </w:tcMar>
+          </w:tcPr>
+          <w:p>
+            <w:r>
+              <w:rPr>
+                <w:rFonts w:ascii="Times New Roman" w:cs="Times New Roman" w:eastAsia="Times New Roman" w:hAnsi="Times New Roman"/>
+                <w:b w:val="false"/>
+                <w:bCs w:val="false"/>
+                <w:sz w:val="22"/>
+                <w:szCs w:val="22"/>
+              </w:rPr>
+              <w:t xml:space="preserve">Koha mesatare e përgjigjes, rruga «RAG»</w:t>
+            </w:r>
+          </w:p>
+        </w:tc>
+        <w:tc>
+          <w:tcPr>
+            <w:tcW w:type="dxa" w:w="1900"/>
+            <w:tcBorders>
+              <w:top w:val="single" w:color="999999" w:sz="4"/>
+              <w:left w:val="single" w:color="999999" w:sz="4"/>
+              <w:bottom w:val="single" w:color="999999" w:sz="4"/>
+              <w:right w:val="single" w:color="999999" w:sz="4"/>
+            </w:tcBorders>
+            <w:tcMar>
+              <w:top w:type="dxa" w:w="60"/>
+              <w:left w:type="dxa" w:w="100"/>
+              <w:bottom w:type="dxa" w:w="60"/>
+              <w:right w:type="dxa" w:w="100"/>
+            </w:tcMar>
+          </w:tcPr>
+          <w:p>
+            <w:r>
+              <w:rPr>
+                <w:rFonts w:ascii="Times New Roman" w:cs="Times New Roman" w:eastAsia="Times New Roman" w:hAnsi="Times New Roman"/>
+                <w:b w:val="false"/>
+                <w:bCs w:val="false"/>
+                <w:sz w:val="22"/>
+                <w:szCs w:val="22"/>
+                <w:shd w:fill="FFFF00" w:color="auto" w:val="clear"/>
+              </w:rPr>
+              <w:t xml:space="preserve">[plotëso]</w:t>
+            </w:r>
+          </w:p>
+        </w:tc>
+        <w:tc>
+          <w:tcPr>
+            <w:tcW w:type="dxa" w:w="2500"/>
+            <w:tcBorders>
+              <w:top w:val="single" w:color="999999" w:sz="4"/>
+              <w:left w:val="single" w:color="999999" w:sz="4"/>
+              <w:bottom w:val="single" w:color="999999" w:sz="4"/>
+              <w:right w:val="single" w:color="999999" w:sz="4"/>
+            </w:tcBorders>
+            <w:tcMar>
+              <w:top w:type="dxa" w:w="60"/>
+              <w:left w:type="dxa" w:w="100"/>
+              <w:bottom w:type="dxa" w:w="60"/>
+              <w:right w:type="dxa" w:w="100"/>
+            </w:tcMar>
+          </w:tcPr>
+          <w:p>
+            <w:r>
+              <w:rPr>
+                <w:rFonts w:ascii="Times New Roman" w:cs="Times New Roman" w:eastAsia="Times New Roman" w:hAnsi="Times New Roman"/>
+                <w:b w:val="false"/>
+                <w:bCs w:val="false"/>
+                <w:sz w:val="22"/>
+                <w:szCs w:val="22"/>
+                <w:shd w:fill="FFFF00" w:color="auto" w:val="clear"/>
+              </w:rPr>
+              <w:t xml:space="preserve">[sekonda]</w:t>
+            </w:r>
+          </w:p>
+        </w:tc>
+      </w:tr>
+      <w:tr>
+        <w:tc>
+          <w:tcPr>
+            <w:tcW w:type="dxa" w:w="4600"/>
+            <w:tcBorders>
+              <w:top w:val="single" w:color="999999" w:sz="4"/>
+              <w:left w:val="single" w:color="999999" w:sz="4"/>
+              <w:bottom w:val="single" w:color="999999" w:sz="4"/>
+              <w:right w:val="single" w:color="999999" w:sz="4"/>
+            </w:tcBorders>
+            <w:tcMar>
+              <w:top w:type="dxa" w:w="60"/>
+              <w:left w:type="dxa" w:w="100"/>
+              <w:bottom w:type="dxa" w:w="60"/>
+              <w:right w:type="dxa" w:w="100"/>
+            </w:tcMar>
+          </w:tcPr>
+          <w:p>
+            <w:r>
+              <w:rPr>
+                <w:rFonts w:ascii="Times New Roman" w:cs="Times New Roman" w:eastAsia="Times New Roman" w:hAnsi="Times New Roman"/>
+                <w:b w:val="false"/>
+                <w:bCs w:val="false"/>
+                <w:sz w:val="22"/>
+                <w:szCs w:val="22"/>
+              </w:rPr>
+              <w:t xml:space="preserve">Koha mesatare e përgjigjes, rruga «asistent»</w:t>
+            </w:r>
+          </w:p>
+        </w:tc>
+        <w:tc>
+          <w:tcPr>
+            <w:tcW w:type="dxa" w:w="1900"/>
+            <w:tcBorders>
+              <w:top w:val="single" w:color="999999" w:sz="4"/>
+              <w:left w:val="single" w:color="999999" w:sz="4"/>
+              <w:bottom w:val="single" w:color="999999" w:sz="4"/>
+              <w:right w:val="single" w:color="999999" w:sz="4"/>
+            </w:tcBorders>
+            <w:tcMar>
+              <w:top w:type="dxa" w:w="60"/>
+              <w:left w:type="dxa" w:w="100"/>
+              <w:bottom w:type="dxa" w:w="60"/>
+              <w:right w:type="dxa" w:w="100"/>
+            </w:tcMar>
+          </w:tcPr>
+          <w:p>
+            <w:r>
+              <w:rPr>
+                <w:rFonts w:ascii="Times New Roman" w:cs="Times New Roman" w:eastAsia="Times New Roman" w:hAnsi="Times New Roman"/>
+                <w:b w:val="false"/>
+                <w:bCs w:val="false"/>
+                <w:sz w:val="22"/>
+                <w:szCs w:val="22"/>
+                <w:shd w:fill="FFFF00" w:color="auto" w:val="clear"/>
+              </w:rPr>
+              <w:t xml:space="preserve">[plotëso]</w:t>
+            </w:r>
+          </w:p>
+        </w:tc>
+        <w:tc>
+          <w:tcPr>
+            <w:tcW w:type="dxa" w:w="2500"/>
+            <w:tcBorders>
+              <w:top w:val="single" w:color="999999" w:sz="4"/>
+              <w:left w:val="single" w:color="999999" w:sz="4"/>
+              <w:bottom w:val="single" w:color="999999" w:sz="4"/>
+              <w:right w:val="single" w:color="999999" w:sz="4"/>
+            </w:tcBorders>
+            <w:tcMar>
+              <w:top w:type="dxa" w:w="60"/>
+              <w:left w:type="dxa" w:w="100"/>
+              <w:bottom w:type="dxa" w:w="60"/>
+              <w:right w:type="dxa" w:w="100"/>
+            </w:tcMar>
+          </w:tcPr>
+          <w:p>
+            <w:r>
+              <w:rPr>
+                <w:rFonts w:ascii="Times New Roman" w:cs="Times New Roman" w:eastAsia="Times New Roman" w:hAnsi="Times New Roman"/>
+                <w:b w:val="false"/>
+                <w:bCs w:val="false"/>
+                <w:sz w:val="22"/>
+                <w:szCs w:val="22"/>
+                <w:shd w:fill="FFFF00" w:color="auto" w:val="clear"/>
               </w:rPr>
               <w:t xml:space="preserve">[sekonda]</w:t>
             </w:r>
@@ -3861,7 +4278,7 @@
           <w:sz w:val="24"/>
           <w:szCs w:val="24"/>
         </w:rPr>
-        <w:t xml:space="preserve">Duhet theksuar një kufizim i metodologjisë. Seti i 25 pyetjeve provon rrugën standarde RAG. Rrugët e personalizuara, si rekomandimet dhe Study Mode, nuk kanë përgjigje të vetme të saktë dhe kërkojnë vlerësim cilësor, p.sh. nga studentë dhe pedagogë, i cili mund të jetë objekt i punës së ardhshme. Gjithashtu, cilësia e përgjigjeve varet drejtpërdrejt nga plotësia e dokumenteve. Aktualisht janë të disponueshme materiale vetëm për një lëndë, ndaj shumica e lëndëve marrin vetëm faktet e planit mësimor.</w:t>
+        <w:t xml:space="preserve">Duhet theksuar disa kufizime të metodologjisë. Vlerësimi manual bëhet nga një person i vetëm, ndaj rezultatet nuk kanë një rregullues të pavarur. Pyetjet e rekomandimit, krahasimit dhe Study Mode nuk kanë përgjigje të vetme të saktë, prandaj për to vlerësimi është kryesisht cilësor dhe bazohet në përgjigjen e pritur si udhëzues, jo si përgjigje e saktë. Një vlerësim më i gjerë, nga studentë dhe pedagogë realë, mund të jetë objekt i punës së ardhshme. Gjithashtu, cilësia e përgjigjeve varet drejtpërdrejt nga plotësia e dokumenteve: materiale lënde ka vetëm për Zhvillim Webi, ndaj për shumicën e lëndëve sistemi mbështetet vetëm te faktet e planit mësimor. Së fundi, pyetjet testuese janë të ndërtuara nga autori i sistemit dhe mund të mos mbulojnë të gjitha mënyrat se si studentët shprehen.</w:t>
       </w:r>
     </w:p>
     <w:sectPr>

</xml_diff>